<commit_message>
Add thesis PNG diagrams and embed them in second draft
Agent-Logs-Url: https://github.com/oussamaes1/k8s-dashboard/sessions/ced169cc-d295-47dc-bdae-fbe7276608b2

Co-authored-by: oussamaes1 <80717161+oussamaes1@users.noreply.github.com>
</commit_message>
<xml_diff>
--- a/Graduation_Thesis_Second_Draft.docx
+++ b/Graduation_Thesis_Second_Draft.docx
@@ -4053,28 +4053,55 @@
     </w:p>
     <w:p>
       <w:r>
-        <w:rPr>
-          <w:rFonts w:ascii="Times New Roman" w:hAnsi="Times New Roman"/>
-          <w:b/>
-          <w:color w:val="000000"/>
-          <w:sz w:val="24"/>
-        </w:rPr>
-        <w:t>[See Figure 3.1 — Use Case Diagram: thesis-diagrams/01_Use_Case_Diagram.drawio]</w:t>
+        <w:t>[See Figure 3.1 — Use Case Diagram: thesis-diagrams/01_Use_Case_Diagram.png]</w:t>
       </w:r>
     </w:p>
     <w:p>
       <w:pPr>
+        <w:jc w:val="center"/>
+      </w:pPr>
+      <w:r>
+        <w:drawing>
+          <wp:inline xmlns:a="http://schemas.openxmlformats.org/drawingml/2006/main" xmlns:pic="http://schemas.openxmlformats.org/drawingml/2006/picture">
+            <wp:extent cx="5669280" cy="3188970"/>
+            <wp:docPr id="1" name="Picture 1"/>
+            <wp:cNvGraphicFramePr>
+              <a:graphicFrameLocks noChangeAspect="1"/>
+            </wp:cNvGraphicFramePr>
+            <a:graphic>
+              <a:graphicData uri="http://schemas.openxmlformats.org/drawingml/2006/picture">
+                <pic:pic>
+                  <pic:nvPicPr>
+                    <pic:cNvPr id="0" name="01_Use_Case_Diagram.png"/>
+                    <pic:cNvPicPr/>
+                  </pic:nvPicPr>
+                  <pic:blipFill>
+                    <a:blip r:embed="rId9"/>
+                    <a:stretch>
+                      <a:fillRect/>
+                    </a:stretch>
+                  </pic:blipFill>
+                  <pic:spPr>
+                    <a:xfrm>
+                      <a:off x="0" y="0"/>
+                      <a:ext cx="5669280" cy="3188970"/>
+                    </a:xfrm>
+                    <a:prstGeom prst="rect"/>
+                  </pic:spPr>
+                </pic:pic>
+              </a:graphicData>
+            </a:graphic>
+          </wp:inline>
+        </w:drawing>
+      </w:r>
+    </w:p>
+    <w:p>
+      <w:pPr>
         <w:spacing w:after="240"/>
         <w:jc w:val="center"/>
       </w:pPr>
       <w:r>
-        <w:rPr>
-          <w:rFonts w:ascii="Times New Roman" w:hAnsi="Times New Roman"/>
-          <w:i/>
-          <w:color w:val="000000"/>
-          <w:sz w:val="20"/>
-        </w:rPr>
-        <w:t>Figure 3.1  Use Case Diagram (see attached Draw.io file: 01_Use_Case_Diagram.drawio)</w:t>
+        <w:t>Figure 3.1  Use Case Diagram</w:t>
       </w:r>
     </w:p>
     <w:p>
@@ -6852,28 +6879,55 @@
     </w:p>
     <w:p>
       <w:r>
-        <w:rPr>
-          <w:rFonts w:ascii="Times New Roman" w:hAnsi="Times New Roman"/>
-          <w:b/>
-          <w:color w:val="000000"/>
-          <w:sz w:val="24"/>
-        </w:rPr>
-        <w:t>[See Figure 4.1 — System Architecture Diagram: thesis-diagrams/03_System_Architecture.drawio]</w:t>
+        <w:t>[See Figure 4.1 — System Architecture Diagram: thesis-diagrams/03_System_Architecture.png]</w:t>
       </w:r>
     </w:p>
     <w:p>
       <w:pPr>
+        <w:jc w:val="center"/>
+      </w:pPr>
+      <w:r>
+        <w:drawing>
+          <wp:inline xmlns:a="http://schemas.openxmlformats.org/drawingml/2006/main" xmlns:pic="http://schemas.openxmlformats.org/drawingml/2006/picture">
+            <wp:extent cx="5669280" cy="3188970"/>
+            <wp:docPr id="2" name="Picture 2"/>
+            <wp:cNvGraphicFramePr>
+              <a:graphicFrameLocks noChangeAspect="1"/>
+            </wp:cNvGraphicFramePr>
+            <a:graphic>
+              <a:graphicData uri="http://schemas.openxmlformats.org/drawingml/2006/picture">
+                <pic:pic>
+                  <pic:nvPicPr>
+                    <pic:cNvPr id="0" name="03_System_Architecture.png"/>
+                    <pic:cNvPicPr/>
+                  </pic:nvPicPr>
+                  <pic:blipFill>
+                    <a:blip r:embed="rId10"/>
+                    <a:stretch>
+                      <a:fillRect/>
+                    </a:stretch>
+                  </pic:blipFill>
+                  <pic:spPr>
+                    <a:xfrm>
+                      <a:off x="0" y="0"/>
+                      <a:ext cx="5669280" cy="3188970"/>
+                    </a:xfrm>
+                    <a:prstGeom prst="rect"/>
+                  </pic:spPr>
+                </pic:pic>
+              </a:graphicData>
+            </a:graphic>
+          </wp:inline>
+        </w:drawing>
+      </w:r>
+    </w:p>
+    <w:p>
+      <w:pPr>
         <w:spacing w:after="240"/>
         <w:jc w:val="center"/>
       </w:pPr>
       <w:r>
-        <w:rPr>
-          <w:rFonts w:ascii="Times New Roman" w:hAnsi="Times New Roman"/>
-          <w:i/>
-          <w:color w:val="000000"/>
-          <w:sz w:val="20"/>
-        </w:rPr>
-        <w:t>Figure 4.1  System Architecture Diagram (see attached Draw.io file: 03_System_Architecture.drawio)</w:t>
+        <w:t>Figure 4.1  System Architecture Diagram</w:t>
       </w:r>
     </w:p>
     <w:p>
@@ -8336,28 +8390,55 @@
     </w:p>
     <w:p>
       <w:r>
-        <w:rPr>
-          <w:rFonts w:ascii="Times New Roman" w:hAnsi="Times New Roman"/>
-          <w:b/>
-          <w:color w:val="000000"/>
-          <w:sz w:val="24"/>
-        </w:rPr>
-        <w:t>[See Figure 4.2 — Database ER Diagram: thesis-diagrams/02_Database_ER_Diagram.drawio]</w:t>
+        <w:t>[See Figure 4.2 — Database ER Diagram: thesis-diagrams/02_Database_ER_Diagram.png]</w:t>
       </w:r>
     </w:p>
     <w:p>
       <w:pPr>
+        <w:jc w:val="center"/>
+      </w:pPr>
+      <w:r>
+        <w:drawing>
+          <wp:inline xmlns:a="http://schemas.openxmlformats.org/drawingml/2006/main" xmlns:pic="http://schemas.openxmlformats.org/drawingml/2006/picture">
+            <wp:extent cx="5669280" cy="3188970"/>
+            <wp:docPr id="3" name="Picture 3"/>
+            <wp:cNvGraphicFramePr>
+              <a:graphicFrameLocks noChangeAspect="1"/>
+            </wp:cNvGraphicFramePr>
+            <a:graphic>
+              <a:graphicData uri="http://schemas.openxmlformats.org/drawingml/2006/picture">
+                <pic:pic>
+                  <pic:nvPicPr>
+                    <pic:cNvPr id="0" name="02_Database_ER_Diagram.png"/>
+                    <pic:cNvPicPr/>
+                  </pic:nvPicPr>
+                  <pic:blipFill>
+                    <a:blip r:embed="rId11"/>
+                    <a:stretch>
+                      <a:fillRect/>
+                    </a:stretch>
+                  </pic:blipFill>
+                  <pic:spPr>
+                    <a:xfrm>
+                      <a:off x="0" y="0"/>
+                      <a:ext cx="5669280" cy="3188970"/>
+                    </a:xfrm>
+                    <a:prstGeom prst="rect"/>
+                  </pic:spPr>
+                </pic:pic>
+              </a:graphicData>
+            </a:graphic>
+          </wp:inline>
+        </w:drawing>
+      </w:r>
+    </w:p>
+    <w:p>
+      <w:pPr>
         <w:spacing w:after="240"/>
         <w:jc w:val="center"/>
       </w:pPr>
       <w:r>
-        <w:rPr>
-          <w:rFonts w:ascii="Times New Roman" w:hAnsi="Times New Roman"/>
-          <w:i/>
-          <w:color w:val="000000"/>
-          <w:sz w:val="20"/>
-        </w:rPr>
-        <w:t>Figure 4.2  Database Entity-Relationship Diagram (see attached Draw.io file: 02_Database_ER_Diagram.drawio)</w:t>
+        <w:t>Figure 4.2  Database Entity-Relationship Diagram</w:t>
       </w:r>
     </w:p>
     <w:p>
@@ -17123,36 +17204,46 @@
         <w:pStyle w:val="Normal"/>
       </w:pPr>
       <w:r>
-        <w:rPr>
-          <w:rFonts w:ascii="Times New Roman" w:hAnsi="Times New Roman" w:eastAsia="SimSun"/>
-          <w:b w:val="0"/>
-          <w:i w:val="0"/>
-          <w:sz w:val="24"/>
-        </w:rPr>
-        <w:t>The anomaly detection data flow is illustrated in Figure 4.5.</w:t>
+        <w:t>[See Figure 4.5 — Anomaly Detection Data Flow: thesis-diagrams/06_Anomaly_Detection_Flow.png]</w:t>
       </w:r>
     </w:p>
     <w:p>
       <w:pPr>
-        <w:pStyle w:val="Normal"/>
         <w:jc w:val="center"/>
-        <w:pBdr>
-          <w:top w:val="single" w:sz="4" w:space="8" w:color="808080"/>
-          <w:left w:val="single" w:sz="4" w:space="8" w:color="808080"/>
-          <w:bottom w:val="single" w:sz="4" w:space="8" w:color="808080"/>
-          <w:right w:val="single" w:sz="4" w:space="8" w:color="808080"/>
-        </w:pBdr>
       </w:pPr>
       <w:r>
-        <w:rPr>
-          <w:rFonts w:ascii="Times New Roman" w:hAnsi="Times New Roman"/>
-          <w:i/>
-          <w:color w:val="808080"/>
-          <w:sz w:val="22"/>
-        </w:rPr>
-        <w:br/>
-        <w:t>[  Screenshot Placeholder: Anomaly Detection Data Flow — showing the pipeline from Kubernetes API metrics collection through feature extraction, StandardScaler normalization, Isolation Forest scoring, Z-score factor analysis, to health score generation and alert triggering  ]</w:t>
-        <w:br/>
+        <w:drawing>
+          <wp:inline xmlns:a="http://schemas.openxmlformats.org/drawingml/2006/main" xmlns:pic="http://schemas.openxmlformats.org/drawingml/2006/picture">
+            <wp:extent cx="5669280" cy="3188970"/>
+            <wp:docPr id="6" name="Picture 6"/>
+            <wp:cNvGraphicFramePr>
+              <a:graphicFrameLocks noChangeAspect="1"/>
+            </wp:cNvGraphicFramePr>
+            <a:graphic>
+              <a:graphicData uri="http://schemas.openxmlformats.org/drawingml/2006/picture">
+                <pic:pic>
+                  <pic:nvPicPr>
+                    <pic:cNvPr id="0" name="image.png"/>
+                    <pic:cNvPicPr/>
+                  </pic:nvPicPr>
+                  <pic:blipFill>
+                    <a:blip r:embed="rId14"/>
+                    <a:stretch>
+                      <a:fillRect/>
+                    </a:stretch>
+                  </pic:blipFill>
+                  <pic:spPr>
+                    <a:xfrm>
+                      <a:off x="0" y="0"/>
+                      <a:ext cx="5669280" cy="3188970"/>
+                    </a:xfrm>
+                    <a:prstGeom prst="rect"/>
+                  </pic:spPr>
+                </pic:pic>
+              </a:graphicData>
+            </a:graphic>
+          </wp:inline>
+        </w:drawing>
       </w:r>
     </w:p>
     <w:p>
@@ -17363,28 +17454,55 @@
     </w:p>
     <w:p>
       <w:r>
-        <w:rPr>
-          <w:rFonts w:ascii="Times New Roman" w:hAnsi="Times New Roman"/>
-          <w:b/>
-          <w:color w:val="000000"/>
-          <w:sz w:val="24"/>
-        </w:rPr>
-        <w:t>[See Figure 4.4 — Deployment Diagram: thesis-diagrams/05_Deployment_Diagram.drawio]</w:t>
+        <w:t>[See Figure 4.4 — Deployment Diagram: thesis-diagrams/05_Deployment_Diagram.png]</w:t>
       </w:r>
     </w:p>
     <w:p>
       <w:pPr>
+        <w:jc w:val="center"/>
+      </w:pPr>
+      <w:r>
+        <w:drawing>
+          <wp:inline xmlns:a="http://schemas.openxmlformats.org/drawingml/2006/main" xmlns:pic="http://schemas.openxmlformats.org/drawingml/2006/picture">
+            <wp:extent cx="5669280" cy="3188970"/>
+            <wp:docPr id="5" name="Picture 5"/>
+            <wp:cNvGraphicFramePr>
+              <a:graphicFrameLocks noChangeAspect="1"/>
+            </wp:cNvGraphicFramePr>
+            <a:graphic>
+              <a:graphicData uri="http://schemas.openxmlformats.org/drawingml/2006/picture">
+                <pic:pic>
+                  <pic:nvPicPr>
+                    <pic:cNvPr id="0" name="05_Deployment_Diagram.png"/>
+                    <pic:cNvPicPr/>
+                  </pic:nvPicPr>
+                  <pic:blipFill>
+                    <a:blip r:embed="rId13"/>
+                    <a:stretch>
+                      <a:fillRect/>
+                    </a:stretch>
+                  </pic:blipFill>
+                  <pic:spPr>
+                    <a:xfrm>
+                      <a:off x="0" y="0"/>
+                      <a:ext cx="5669280" cy="3188970"/>
+                    </a:xfrm>
+                    <a:prstGeom prst="rect"/>
+                  </pic:spPr>
+                </pic:pic>
+              </a:graphicData>
+            </a:graphic>
+          </wp:inline>
+        </w:drawing>
+      </w:r>
+    </w:p>
+    <w:p>
+      <w:pPr>
         <w:spacing w:after="240"/>
         <w:jc w:val="center"/>
       </w:pPr>
       <w:r>
-        <w:rPr>
-          <w:rFonts w:ascii="Times New Roman" w:hAnsi="Times New Roman"/>
-          <w:i/>
-          <w:color w:val="000000"/>
-          <w:sz w:val="20"/>
-        </w:rPr>
-        <w:t>Figure 4.4  Deployment Diagram (see attached Draw.io file: 05_Deployment_Diagram.drawio)</w:t>
+        <w:t>Figure 4.4  Deployment Diagram (Docker Compose)</w:t>
       </w:r>
     </w:p>
     <w:p>
@@ -18088,28 +18206,55 @@
     </w:p>
     <w:p>
       <w:r>
-        <w:rPr>
-          <w:rFonts w:ascii="Times New Roman" w:hAnsi="Times New Roman"/>
-          <w:b/>
-          <w:color w:val="000000"/>
-          <w:sz w:val="24"/>
-        </w:rPr>
-        <w:t>[See Figure 4.3 — Authentication Sequence Diagram: thesis-diagrams/04_Auth_Sequence_Diagram.drawio]</w:t>
+        <w:t>[See Figure 4.3 — Authentication Sequence Diagram: thesis-diagrams/04_Auth_Sequence_Diagram.png]</w:t>
       </w:r>
     </w:p>
     <w:p>
       <w:pPr>
+        <w:jc w:val="center"/>
+      </w:pPr>
+      <w:r>
+        <w:drawing>
+          <wp:inline xmlns:a="http://schemas.openxmlformats.org/drawingml/2006/main" xmlns:pic="http://schemas.openxmlformats.org/drawingml/2006/picture">
+            <wp:extent cx="5669280" cy="3188970"/>
+            <wp:docPr id="4" name="Picture 4"/>
+            <wp:cNvGraphicFramePr>
+              <a:graphicFrameLocks noChangeAspect="1"/>
+            </wp:cNvGraphicFramePr>
+            <a:graphic>
+              <a:graphicData uri="http://schemas.openxmlformats.org/drawingml/2006/picture">
+                <pic:pic>
+                  <pic:nvPicPr>
+                    <pic:cNvPr id="0" name="04_Auth_Sequence_Diagram.png"/>
+                    <pic:cNvPicPr/>
+                  </pic:nvPicPr>
+                  <pic:blipFill>
+                    <a:blip r:embed="rId12"/>
+                    <a:stretch>
+                      <a:fillRect/>
+                    </a:stretch>
+                  </pic:blipFill>
+                  <pic:spPr>
+                    <a:xfrm>
+                      <a:off x="0" y="0"/>
+                      <a:ext cx="5669280" cy="3188970"/>
+                    </a:xfrm>
+                    <a:prstGeom prst="rect"/>
+                  </pic:spPr>
+                </pic:pic>
+              </a:graphicData>
+            </a:graphic>
+          </wp:inline>
+        </w:drawing>
+      </w:r>
+    </w:p>
+    <w:p>
+      <w:pPr>
         <w:spacing w:after="240"/>
         <w:jc w:val="center"/>
       </w:pPr>
       <w:r>
-        <w:rPr>
-          <w:rFonts w:ascii="Times New Roman" w:hAnsi="Times New Roman"/>
-          <w:i/>
-          <w:color w:val="000000"/>
-          <w:sz w:val="20"/>
-        </w:rPr>
-        <w:t>Figure 4.3  Authentication Sequence Diagram (see attached Draw.io file: 04_Auth_Sequence_Diagram.drawio)</w:t>
+        <w:t>Figure 4.3  Authentication Sequence Diagram</w:t>
       </w:r>
     </w:p>
     <w:p>

</xml_diff>

<commit_message>
Improve thesis diagrams (higher resolution, clearer layouts, legends) and add 45+ in-text citations with 5 new references
Agent-Logs-Url: https://github.com/oussamaes1/k8s-dashboard/sessions/ff5f12fc-829d-43e7-98f2-bbfed6f79a42

Co-authored-by: oussamaes1 <80717161+oussamaes1@users.noreply.github.com>
</commit_message>
<xml_diff>
--- a/Graduation_Thesis_Second_Draft.docx
+++ b/Graduation_Thesis_Second_Draft.docx
@@ -219,7 +219,7 @@
           <w:color w:val="000000"/>
           <w:sz w:val="24"/>
         </w:rPr>
-        <w:t>As cloud-native technologies become the backbone of modern software infrastructure, Kubernetes has emerged as the de facto standard for container orchestration. However, the inherent complexity of managing distributed Kubernetes clusters presents significant challenges for DevOps engineers, particularly in the areas of real-time monitoring, log aggregation, and anomaly detection. This thesis presents the design and implementation of a comprehensive web-based dashboard for Kubernetes cluster monitoring and management. The system integrates a React/TypeScript frontend with a Python/FastAPI backend, providing a unified platform for multi-cluster management, real-time metrics visualization, centralized log aggregation, and AI-powered anomaly detection using the Isolation Forest algorithm.</w:t>
+        <w:t>As cloud-native technologies become the backbone of modern software infrastructure, Kubernetes has emerged as the de facto standard for container orchestration [1]. However, the inherent complexity of managing distributed Kubernetes clusters presents significant challenges for DevOps engineers, particularly in the areas of real-time monitoring, log aggregation, and anomaly detection. This thesis presents the design and implementation of a comprehensive web-based dashboard for Kubernetes cluster monitoring and management. The system integrates a React/TypeScript frontend with a Python/FastAPI backend, providing a unified platform for multi-cluster management, real-time metrics visualization, centralized log aggregation, and AI-powered anomaly detection using the Isolation Forest algorithm.</w:t>
       </w:r>
     </w:p>
     <w:p>
@@ -233,7 +233,7 @@
           <w:color w:val="000000"/>
           <w:sz w:val="24"/>
         </w:rPr>
-        <w:t>The dashboard features multi-user role-based access control (RBAC), encrypted credential storage using Fernet symmetric encryption, comprehensive audit logging, and namespace-level resource isolation. The system architecture follows a three-tier design pattern with containerized deployment via Docker Compose. The anomaly detection module employs an unsupervised machine learning approach to identify unusual patterns in cluster metrics without requiring labeled training data. Experimental evaluation demonstrates that the system successfully provides a cohesive monitoring experience while reducing the cognitive overhead traditionally associated with Kubernetes cluster management.</w:t>
+        <w:t>The dashboard features multi-user role-based access control (RBAC), encrypted credential storage using Fernet symmetric encryption, comprehensive audit logging, and namespace-level resource isolation. The system architecture follows a three-tier design pattern with containerized deployment via Docker Compose [10]. The anomaly detection module employs an unsupervised machine learning approach to identify unusual patterns in cluster metrics without requiring labeled training data. Experimental evaluation demonstrates that the system successfully provides a cohesive monitoring experience while reducing the cognitive overhead traditionally associated with Kubernetes cluster management.</w:t>
       </w:r>
     </w:p>
     <w:p>
@@ -1461,7 +1461,7 @@
           <w:color w:val="000000"/>
           <w:sz w:val="24"/>
         </w:rPr>
-        <w:t>Furthermore, the emergence of AIOps (Artificial Intelligence for IT Operations) has introduced the possibility of using machine learning to automatically detect anomalies and assist in root cause analysis. However, most existing AIOps solutions are complex, expensive, and designed for large enterprise environments, leaving a gap for lightweight, accessible solutions suitable for small to medium-sized teams and educational purposes.</w:t>
+        <w:t>Furthermore, the emergence of AIOps (Artificial Intelligence for IT Operations) [5] has introduced the possibility of using machine learning to automatically detect anomalies and assist in root cause analysis. However, most existing AIOps solutions are complex, expensive, and designed for large enterprise environments, leaving a gap for lightweight, accessible solutions suitable for small to medium-sized teams and educational purposes.</w:t>
       </w:r>
     </w:p>
     <w:p>
@@ -1476,7 +1476,7 @@
           <w:i w:val="0"/>
           <w:sz w:val="24"/>
         </w:rPr>
-        <w:t>Recent industry reports indicate that the global container orchestration market is projected to reach $6.4 billion by 2028, driven by increased enterprise adoption of microservices architectures and DevOps practices. This growth has created an urgent need for monitoring solutions that can scale with infrastructure complexity while remaining accessible to operations teams of varying skill levels.</w:t>
+        <w:t>Recent industry reports indicate that the global container orchestration market is projected to reach $6.4 billion by 2028, driven by increased enterprise adoption of microservices [18] architectures and DevOps practices. This growth has created an urgent need for monitoring solutions that can scale with infrastructure complexity while remaining accessible to operations teams of varying skill levels.</w:t>
       </w:r>
     </w:p>
     <w:p>
@@ -1549,7 +1549,7 @@
           <w:rFonts w:ascii="Times New Roman" w:hAnsi="Times New Roman"/>
           <w:sz w:val="24"/>
         </w:rPr>
-        <w:t>(3) To integrate the Isolation Forest unsupervised machine learning algorithm for automatic anomaly detection in cluster metrics.</w:t>
+        <w:t>(3) To integrate the Isolation Forest unsupervised machine learning algorithm [3][4] for automatic anomaly detection in cluster metrics.</w:t>
       </w:r>
     </w:p>
     <w:p>
@@ -1573,7 +1573,7 @@
           <w:rFonts w:ascii="Times New Roman" w:hAnsi="Times New Roman"/>
           <w:sz w:val="24"/>
         </w:rPr>
-        <w:t>(5) To design a three-tier architecture using modern technologies (React, FastAPI, SQLAlchemy) with containerized deployment via Docker Compose.</w:t>
+        <w:t>(5) To design a three-tier architecture using modern technologies (React, FastAPI, SQLAlchemy) with containerized deployment via Docker Compose [10].</w:t>
       </w:r>
     </w:p>
     <w:p>
@@ -1860,7 +1860,7 @@
           <w:color w:val="000000"/>
           <w:sz w:val="24"/>
         </w:rPr>
-        <w:t>Cloud-native computing refers to an approach to building and running applications that fully exploits the advantages of cloud computing delivery models. The Cloud Native Computing Foundation (CNCF) defines cloud-native technologies as those that "empower organizations to build and run scalable applications in modern, dynamic environments such as public, private, and hybrid clouds." Key characteristics include containerization, microservices architecture, dynamic orchestration, and declarative APIs.</w:t>
+        <w:t>Cloud-native computing refers to an approach to building and running applications that fully exploits the advantages of cloud computing delivery models. The Cloud Native Computing Foundation (CNCF) defines [2] cloud-native technologies as those that "empower organizations to build and run scalable applications in modern, dynamic environments such as public, private, and hybrid clouds." Key characteristics include containerization, microservices [18] architecture, dynamic orchestration, and declarative APIs.</w:t>
       </w:r>
     </w:p>
     <w:p>
@@ -1874,7 +1874,7 @@
           <w:color w:val="000000"/>
           <w:sz w:val="24"/>
         </w:rPr>
-        <w:t>Kubernetes, originally developed by Google based on their internal Borg system, was open-sourced in 2014 and donated to the CNCF in 2015. It provides automated deployment, scaling, and management of containerized applications. The Kubernetes architecture consists of a control plane (API server, scheduler, controller manager, etcd) and worker nodes (kubelet, kube-proxy, container runtime). Resources are organized into namespaces and managed through declarative YAML manifests.</w:t>
+        <w:t>Kubernetes, originally developed by Google based on their internal Borg system [17] [1], was open-sourced in 2014 and donated to the CNCF in 2015. It provides automated deployment, scaling, and management of containerized applications. The Kubernetes architecture consists of a control plane [6] (API server, scheduler, controller manager, etcd) and worker nodes (kubelet, kube-proxy, container runtime). Resources are organized into namespaces and managed through declarative YAML manifests.</w:t>
       </w:r>
     </w:p>
     <w:p>
@@ -1888,7 +1888,7 @@
           <w:color w:val="000000"/>
           <w:sz w:val="24"/>
         </w:rPr>
-        <w:t>The growth of Kubernetes adoption has been remarkable. The CNCF 2024 survey reports that 96% of organizations use or evaluate Kubernetes, with 63% running it in production. This widespread adoption creates a strong demand for effective monitoring and management tools.</w:t>
+        <w:t>The growth of Kubernetes adoption has been remarkable. The CNCF 2024 survey reports that 96% of organizations [2] use or evaluate Kubernetes, with 63% running it in production. This widespread adoption creates a strong demand for effective monitoring and management tools.</w:t>
       </w:r>
     </w:p>
     <w:p>
@@ -1903,7 +1903,7 @@
           <w:i w:val="0"/>
           <w:sz w:val="24"/>
         </w:rPr>
-        <w:t>The Kubernetes architecture consists of a control plane and worker nodes. The control plane includes the API server (kube-apiserver), scheduler (kube-scheduler), controller manager (kube-controller-manager), and distributed key-value store (etcd). Worker nodes run the kubelet agent, container runtime (containerd or CRI-O), and kube-proxy for network services. Understanding this architecture is essential for designing effective monitoring solutions, as each component generates distinct telemetry signals.</w:t>
+        <w:t>The Kubernetes architecture consists of a control plane [6] and worker nodes. The control plane includes the API server (kube-apiserver), scheduler (kube-scheduler), controller manager (kube-controller-manager), and distributed key-value store (etcd). Worker nodes run the kubelet agent, container runtime (containerd or CRI-O), and kube-proxy for network services. Understanding this architecture is essential for designing effective monitoring solutions, as each component generates distinct telemetry signals.</w:t>
       </w:r>
     </w:p>
     <w:p>
@@ -1918,7 +1918,7 @@
           <w:i w:val="0"/>
           <w:sz w:val="24"/>
         </w:rPr>
-        <w:t>Resource management in Kubernetes operates through declarative configuration objects. Deployments specify desired pod replica counts and update strategies. Services provide stable networking endpoints for pod groups. ConfigMaps and Secrets manage application configuration. The system continuously reconciles actual state with desired state through control loops, creating a rich stream of events that monitoring tools can leverage for anomaly detection.</w:t>
+        <w:t>Resource management in Kubernetes operates through declarative [1][6] configuration objects. Deployments specify desired pod replica counts and update strategies. Services provide stable networking endpoints for pod groups. ConfigMaps and Secrets manage application configuration. The system continuously reconciles actual state with desired state through control loops, creating a rich stream of events that monitoring tools can leverage for anomaly detection.</w:t>
       </w:r>
     </w:p>
     <w:p>
@@ -1954,7 +1954,7 @@
           <w:color w:val="000000"/>
           <w:sz w:val="24"/>
         </w:rPr>
-        <w:t>Prometheus + Grafana: Prometheus is the standard open-source monitoring system for Kubernetes, collecting time-series metrics via a pull model. Grafana provides visualization dashboards. While powerful, this combination requires significant configuration effort and does not include log management or anomaly detection.</w:t>
+        <w:t>Prometheus + Grafana: Prometheus is the standard open-source monitoring system [11] for Kubernetes, collecting time-series metrics via a pull model. Grafana provides visualization dashboards [12]. While powerful, this combination requires significant configuration effort and does not include log management or anomaly detection.</w:t>
       </w:r>
     </w:p>
     <w:p>
@@ -1968,7 +1968,7 @@
           <w:color w:val="000000"/>
           <w:sz w:val="24"/>
         </w:rPr>
-        <w:t>Kubernetes Dashboard: The official Kubernetes dashboard provides a web UI for cluster management but offers limited monitoring capabilities, no log aggregation, and no anomaly detection features.</w:t>
+        <w:t>Kubernetes Dashboard: The official Kubernetes dashboard provides a web UI [6] for cluster management but offers limited monitoring capabilities, no log aggregation, and no anomaly detection features.</w:t>
       </w:r>
     </w:p>
     <w:p>
@@ -2048,7 +2048,7 @@
           <w:color w:val="000000"/>
           <w:sz w:val="24"/>
         </w:rPr>
-        <w:t>AIOps (Artificial Intelligence for IT Operations) is an emerging field that applies machine learning and big data analytics to IT operations. Gartner coined the term in 2017, defining it as the use of big data, machine learning, and other advanced analytics technologies to enhance IT operations. Key AIOps capabilities include anomaly detection, event correlation, root cause analysis, and predictive analytics.</w:t>
+        <w:t>AIOps (Artificial Intelligence for IT Operations) [5] is an emerging field that applies machine learning and big data analytics to IT operations. Gartner coined the term in 2017, defining it as the use of big data, machine learning, and other advanced analytics technologies to enhance IT operations. Key AIOps capabilities include anomaly detection, event correlation, root cause analysis, and predictive analytics.</w:t>
       </w:r>
     </w:p>
     <w:p>
@@ -2062,7 +2062,7 @@
           <w:color w:val="000000"/>
           <w:sz w:val="24"/>
         </w:rPr>
-        <w:t>In the context of Kubernetes monitoring, anomaly detection aims to identify unusual patterns in cluster metrics that may indicate problems such as resource exhaustion, failing pods, or performance degradation. Two main approaches exist: supervised learning (requiring labeled historical data of normal vs. abnormal behavior) and unsupervised learning (detecting deviations from normal patterns without labels).</w:t>
+        <w:t>In the context of Kubernetes monitoring, anomaly detection aims to identify unusual patterns [16] in cluster metrics that may indicate problems such as resource exhaustion, failing pods, or performance degradation. Two main approaches exist: supervised learning (requiring labeled historical data of normal vs. abnormal behavior) and unsupervised learning (detecting deviations from normal patterns without labels).</w:t>
       </w:r>
     </w:p>
     <w:p>
@@ -2076,7 +2076,7 @@
           <w:color w:val="000000"/>
           <w:sz w:val="24"/>
         </w:rPr>
-        <w:t>Unsupervised approaches are particularly valuable for infrastructure monitoring because labeled anomaly data is scarce, and the definition of "anomalous" varies across environments. The Isolation Forest algorithm has emerged as a leading choice for this application due to its efficiency, scalability, and ability to handle high-dimensional data.</w:t>
+        <w:t>Unsupervised approaches are particularly valuable for infrastructure monitoring [16][20] because labeled anomaly data is scarce, and the definition of "anomalous" varies across environments. The Isolation Forest algorithm has emerged as a leading choice for this application due to its efficiency, scalability, and ability to handle high-dimensional data.</w:t>
       </w:r>
     </w:p>
     <w:p>
@@ -2098,7 +2098,7 @@
           <w:color w:val="000000"/>
           <w:sz w:val="24"/>
         </w:rPr>
-        <w:t>The Isolation Forest algorithm, proposed by Liu, Ting, and Zhou (2008), is an unsupervised anomaly detection method based on the concept that anomalies are "few and different." Unlike traditional methods that build a profile of normal behavior, Isolation Forest directly isolates anomalies by exploiting their susceptibility to isolation in random partitions of the feature space.</w:t>
+        <w:t>The Isolation Forest algorithm, proposed by Liu, Ting, and Zhou (2008) [3], is an unsupervised anomaly detection method based on the concept that anomalies are "few and different." Unlike traditional methods that build a profile of normal behavior, Isolation Forest directly isolates anomalies by exploiting their susceptibility to isolation in random partitions of the feature space.</w:t>
       </w:r>
     </w:p>
     <w:p>
@@ -2141,7 +2141,7 @@
           <w:i w:val="0"/>
           <w:sz w:val="24"/>
         </w:rPr>
-        <w:t>The anomaly score s(x, n) for an observation x is defined as: s(x, n) = 2^(-E(h(x))/c(n)), where E(h(x)) is the expected path length across all isolation trees, and c(n) is the average path length of unsuccessful searches in a Binary Search Tree with n nodes. A score close to 1 indicates a strong anomaly, while scores around 0.5 suggest normal observations. This scoring mechanism provides an intuitive and interpretable metric for assessing the degree of abnormality.</w:t>
+        <w:t>The anomaly score s(x, n) for an observation [4] x is defined as: s(x, n) = 2^(-E(h(x))/c(n)), where E(h(x)) is the expected path length across all isolation trees, and c(n) is the average path length of unsuccessful searches in a Binary Search Tree with n nodes. A score close to 1 indicates a strong anomaly, while scores around 0.5 suggest normal observations. This scoring mechanism provides an intuitive and interpretable metric for assessing the degree of abnormality.</w:t>
       </w:r>
     </w:p>
     <w:p>
@@ -4052,9 +4052,7 @@
       </w:r>
     </w:p>
     <w:p>
-      <w:r>
-        <w:t>[See Figure 3.1 — Use Case Diagram: thesis-diagrams/01_Use_Case_Diagram.png]</w:t>
-      </w:r>
+      <w:r/>
     </w:p>
     <w:p>
       <w:pPr>
@@ -4063,8 +4061,8 @@
       <w:r>
         <w:drawing>
           <wp:inline xmlns:a="http://schemas.openxmlformats.org/drawingml/2006/main" xmlns:pic="http://schemas.openxmlformats.org/drawingml/2006/picture">
-            <wp:extent cx="5669280" cy="3188970"/>
-            <wp:docPr id="1" name="Picture 1"/>
+            <wp:extent cx="5486400" cy="3657600"/>
+            <wp:docPr id="7" name="Picture 7"/>
             <wp:cNvGraphicFramePr>
               <a:graphicFrameLocks noChangeAspect="1"/>
             </wp:cNvGraphicFramePr>
@@ -4076,7 +4074,7 @@
                     <pic:cNvPicPr/>
                   </pic:nvPicPr>
                   <pic:blipFill>
-                    <a:blip r:embed="rId9"/>
+                    <a:blip r:embed="rId15"/>
                     <a:stretch>
                       <a:fillRect/>
                     </a:stretch>
@@ -4084,7 +4082,7 @@
                   <pic:spPr>
                     <a:xfrm>
                       <a:off x="0" y="0"/>
-                      <a:ext cx="5669280" cy="3188970"/>
+                      <a:ext cx="5486400" cy="3657600"/>
                     </a:xfrm>
                     <a:prstGeom prst="rect"/>
                   </pic:spPr>
@@ -6874,13 +6872,11 @@
           <w:color w:val="000000"/>
           <w:sz w:val="24"/>
         </w:rPr>
-        <w:t>The K8s Dashboard follows a three-tier architecture pattern consisting of the Presentation Layer (frontend), the Application Layer (backend), and the Data Layer (database and external Kubernetes clusters). The system is containerized using Docker and orchestrated with Docker Compose for simplified deployment.</w:t>
+        <w:t>The K8s Dashboard follows a three-tier architecture [15] pattern consisting of the Presentation Layer (frontend), the Application Layer (backend), and the Data Layer (database and external Kubernetes clusters). The system is containerized using Docker and orchestrated with Docker Compose for simplified deployment.</w:t>
       </w:r>
     </w:p>
     <w:p>
-      <w:r>
-        <w:t>[See Figure 4.1 — System Architecture Diagram: thesis-diagrams/03_System_Architecture.png]</w:t>
-      </w:r>
+      <w:r/>
     </w:p>
     <w:p>
       <w:pPr>
@@ -6889,8 +6885,8 @@
       <w:r>
         <w:drawing>
           <wp:inline xmlns:a="http://schemas.openxmlformats.org/drawingml/2006/main" xmlns:pic="http://schemas.openxmlformats.org/drawingml/2006/picture">
-            <wp:extent cx="5669280" cy="3188970"/>
-            <wp:docPr id="2" name="Picture 2"/>
+            <wp:extent cx="5486400" cy="3429000"/>
+            <wp:docPr id="8" name="Picture 8"/>
             <wp:cNvGraphicFramePr>
               <a:graphicFrameLocks noChangeAspect="1"/>
             </wp:cNvGraphicFramePr>
@@ -6902,7 +6898,7 @@
                     <pic:cNvPicPr/>
                   </pic:nvPicPr>
                   <pic:blipFill>
-                    <a:blip r:embed="rId10"/>
+                    <a:blip r:embed="rId16"/>
                     <a:stretch>
                       <a:fillRect/>
                     </a:stretch>
@@ -6910,7 +6906,7 @@
                   <pic:spPr>
                     <a:xfrm>
                       <a:off x="0" y="0"/>
-                      <a:ext cx="5669280" cy="3188970"/>
+                      <a:ext cx="5486400" cy="3429000"/>
                     </a:xfrm>
                     <a:prstGeom prst="rect"/>
                   </pic:spPr>
@@ -6955,7 +6951,7 @@
           <w:color w:val="000000"/>
           <w:sz w:val="24"/>
         </w:rPr>
-        <w:t>(1) Separation of Concerns: The frontend and backend are completely decoupled, communicating only through a RESTful JSON API. This allows independent development and deployment.</w:t>
+        <w:t>(1) Separation of Concerns: The frontend and backend are completely decoupled, communicating only through a RESTful JSON API [7]. This allows independent development and deployment.</w:t>
       </w:r>
     </w:p>
     <w:p>
@@ -7012,7 +7008,7 @@
           <w:i w:val="0"/>
           <w:sz w:val="24"/>
         </w:rPr>
-        <w:t>(5) Stateless API Design: The backend API follows REST principles with stateless request handling. Each request carries its own authentication context via JWT tokens, enabling horizontal scalability without session affinity requirements.</w:t>
+        <w:t>(5) Stateless API Design: The backend API follows REST principles [19] with stateless request handling. Each request carries its own authentication context via JWT tokens, enabling horizontal scalability without session affinity requirements.</w:t>
       </w:r>
     </w:p>
     <w:p>
@@ -8389,9 +8385,7 @@
       </w:r>
     </w:p>
     <w:p>
-      <w:r>
-        <w:t>[See Figure 4.2 — Database ER Diagram: thesis-diagrams/02_Database_ER_Diagram.png]</w:t>
-      </w:r>
+      <w:r/>
     </w:p>
     <w:p>
       <w:pPr>
@@ -8400,8 +8394,8 @@
       <w:r>
         <w:drawing>
           <wp:inline xmlns:a="http://schemas.openxmlformats.org/drawingml/2006/main" xmlns:pic="http://schemas.openxmlformats.org/drawingml/2006/picture">
-            <wp:extent cx="5669280" cy="3188970"/>
-            <wp:docPr id="3" name="Picture 3"/>
+            <wp:extent cx="5486400" cy="4114800"/>
+            <wp:docPr id="9" name="Picture 9"/>
             <wp:cNvGraphicFramePr>
               <a:graphicFrameLocks noChangeAspect="1"/>
             </wp:cNvGraphicFramePr>
@@ -8413,7 +8407,7 @@
                     <pic:cNvPicPr/>
                   </pic:nvPicPr>
                   <pic:blipFill>
-                    <a:blip r:embed="rId11"/>
+                    <a:blip r:embed="rId17"/>
                     <a:stretch>
                       <a:fillRect/>
                     </a:stretch>
@@ -8421,7 +8415,7 @@
                   <pic:spPr>
                     <a:xfrm>
                       <a:off x="0" y="0"/>
-                      <a:ext cx="5669280" cy="3188970"/>
+                      <a:ext cx="5486400" cy="4114800"/>
                     </a:xfrm>
                     <a:prstGeom prst="rect"/>
                   </pic:spPr>
@@ -16596,7 +16590,7 @@
           <w:color w:val="000000"/>
           <w:sz w:val="24"/>
         </w:rPr>
-        <w:t>The anomaly detection module uses the Isolation Forest algorithm from scikit-learn to perform unsupervised anomaly detection on cluster metrics. The module is implemented in the AnomalyDetector service class.</w:t>
+        <w:t>The anomaly detection module uses the Isolation Forest algorithm from scikit-learn [3][9] to perform unsupervised anomaly detection on cluster metrics. The module is implemented in the AnomalyDetector service class.</w:t>
       </w:r>
     </w:p>
     <w:p>
@@ -17203,9 +17197,7 @@
       <w:pPr>
         <w:pStyle w:val="Normal"/>
       </w:pPr>
-      <w:r>
-        <w:t>[See Figure 4.5 — Anomaly Detection Data Flow: thesis-diagrams/06_Anomaly_Detection_Flow.png]</w:t>
-      </w:r>
+      <w:r/>
     </w:p>
     <w:p>
       <w:pPr>
@@ -17214,8 +17206,8 @@
       <w:r>
         <w:drawing>
           <wp:inline xmlns:a="http://schemas.openxmlformats.org/drawingml/2006/main" xmlns:pic="http://schemas.openxmlformats.org/drawingml/2006/picture">
-            <wp:extent cx="5669280" cy="3188970"/>
-            <wp:docPr id="6" name="Picture 6"/>
+            <wp:extent cx="5486400" cy="3200400"/>
+            <wp:docPr id="10" name="Picture 10"/>
             <wp:cNvGraphicFramePr>
               <a:graphicFrameLocks noChangeAspect="1"/>
             </wp:cNvGraphicFramePr>
@@ -17223,11 +17215,11 @@
               <a:graphicData uri="http://schemas.openxmlformats.org/drawingml/2006/picture">
                 <pic:pic>
                   <pic:nvPicPr>
-                    <pic:cNvPr id="0" name="image.png"/>
+                    <pic:cNvPr id="0" name="06_Anomaly_Detection_Flow.png"/>
                     <pic:cNvPicPr/>
                   </pic:nvPicPr>
                   <pic:blipFill>
-                    <a:blip r:embed="rId14"/>
+                    <a:blip r:embed="rId20"/>
                     <a:stretch>
                       <a:fillRect/>
                     </a:stretch>
@@ -17235,7 +17227,7 @@
                   <pic:spPr>
                     <a:xfrm>
                       <a:off x="0" y="0"/>
-                      <a:ext cx="5669280" cy="3188970"/>
+                      <a:ext cx="5486400" cy="3200400"/>
                     </a:xfrm>
                     <a:prstGeom prst="rect"/>
                   </pic:spPr>
@@ -17325,7 +17317,7 @@
           <w:color w:val="000000"/>
           <w:sz w:val="24"/>
         </w:rPr>
-        <w:t>Authentication: JWT (JSON Web Token) with HS256 algorithm. Tokens include the username and role in the payload, with a configurable expiration (default: 480 minutes).</w:t>
+        <w:t>Authentication: JWT (JSON Web Token) with HS256 algorithm [13]. Tokens include the username and role in the payload, with a configurable expiration (default: 480 minutes).</w:t>
       </w:r>
     </w:p>
     <w:p>
@@ -17339,7 +17331,7 @@
           <w:color w:val="000000"/>
           <w:sz w:val="24"/>
         </w:rPr>
-        <w:t>Password Security: All passwords are hashed using bcrypt with an adaptive cost factor. Legacy SHA-256 hashes are automatically upgraded to bcrypt on login.</w:t>
+        <w:t>Password Security: All passwords are hashed using bcrypt [14] with an adaptive cost factor. Legacy SHA-256 hashes are automatically upgraded to bcrypt on login.</w:t>
       </w:r>
     </w:p>
     <w:p>
@@ -17353,7 +17345,7 @@
           <w:color w:val="000000"/>
           <w:sz w:val="24"/>
         </w:rPr>
-        <w:t>Credential Encryption: Kubeconfig files and API tokens are encrypted at rest using Fernet symmetric encryption (AES-128-CBC with HMAC-SHA256). The encryption key is derived using PBKDF2-HMAC with 100,000 iterations.</w:t>
+        <w:t>Credential Encryption: Kubeconfig files and API tokens are encrypted at rest using Fernet symmetric encryption (AES-128-CBC with HMAC-SHA256) [14]. The encryption key is derived using PBKDF2-HMAC with 100,000 iterations.</w:t>
       </w:r>
     </w:p>
     <w:p>
@@ -17453,9 +17445,7 @@
       </w:r>
     </w:p>
     <w:p>
-      <w:r>
-        <w:t>[See Figure 4.4 — Deployment Diagram: thesis-diagrams/05_Deployment_Diagram.png]</w:t>
-      </w:r>
+      <w:r/>
     </w:p>
     <w:p>
       <w:pPr>
@@ -17464,8 +17454,8 @@
       <w:r>
         <w:drawing>
           <wp:inline xmlns:a="http://schemas.openxmlformats.org/drawingml/2006/main" xmlns:pic="http://schemas.openxmlformats.org/drawingml/2006/picture">
-            <wp:extent cx="5669280" cy="3188970"/>
-            <wp:docPr id="5" name="Picture 5"/>
+            <wp:extent cx="5486400" cy="3200400"/>
+            <wp:docPr id="11" name="Picture 11"/>
             <wp:cNvGraphicFramePr>
               <a:graphicFrameLocks noChangeAspect="1"/>
             </wp:cNvGraphicFramePr>
@@ -17477,7 +17467,7 @@
                     <pic:cNvPicPr/>
                   </pic:nvPicPr>
                   <pic:blipFill>
-                    <a:blip r:embed="rId13"/>
+                    <a:blip r:embed="rId19"/>
                     <a:stretch>
                       <a:fillRect/>
                     </a:stretch>
@@ -17485,7 +17475,7 @@
                   <pic:spPr>
                     <a:xfrm>
                       <a:off x="0" y="0"/>
-                      <a:ext cx="5669280" cy="3188970"/>
+                      <a:ext cx="5486400" cy="3200400"/>
                     </a:xfrm>
                     <a:prstGeom prst="rect"/>
                   </pic:spPr>
@@ -17941,7 +17931,7 @@
           <w:color w:val="000000"/>
           <w:sz w:val="24"/>
         </w:rPr>
-        <w:t>The backend is implemented in Python using the FastAPI framework. The project follows a modular structure with separate directories for API routes, services, and utilities.</w:t>
+        <w:t>The backend is implemented in Python using the FastAPI framework [7]. The project follows a modular structure with separate directories for API routes, services, and utilities.</w:t>
       </w:r>
     </w:p>
     <w:p>
@@ -18205,9 +18195,7 @@
       </w:r>
     </w:p>
     <w:p>
-      <w:r>
-        <w:t>[See Figure 4.3 — Authentication Sequence Diagram: thesis-diagrams/04_Auth_Sequence_Diagram.png]</w:t>
-      </w:r>
+      <w:r/>
     </w:p>
     <w:p>
       <w:pPr>
@@ -18216,8 +18204,8 @@
       <w:r>
         <w:drawing>
           <wp:inline xmlns:a="http://schemas.openxmlformats.org/drawingml/2006/main" xmlns:pic="http://schemas.openxmlformats.org/drawingml/2006/picture">
-            <wp:extent cx="5669280" cy="3188970"/>
-            <wp:docPr id="4" name="Picture 4"/>
+            <wp:extent cx="5486400" cy="3429000"/>
+            <wp:docPr id="12" name="Picture 12"/>
             <wp:cNvGraphicFramePr>
               <a:graphicFrameLocks noChangeAspect="1"/>
             </wp:cNvGraphicFramePr>
@@ -18229,7 +18217,7 @@
                     <pic:cNvPicPr/>
                   </pic:nvPicPr>
                   <pic:blipFill>
-                    <a:blip r:embed="rId12"/>
+                    <a:blip r:embed="rId18"/>
                     <a:stretch>
                       <a:fillRect/>
                     </a:stretch>
@@ -18237,7 +18225,7 @@
                   <pic:spPr>
                     <a:xfrm>
                       <a:off x="0" y="0"/>
-                      <a:ext cx="5669280" cy="3188970"/>
+                      <a:ext cx="5486400" cy="3429000"/>
                     </a:xfrm>
                     <a:prstGeom prst="rect"/>
                   </pic:spPr>
@@ -18276,7 +18264,7 @@
           <w:color w:val="000000"/>
           <w:sz w:val="24"/>
         </w:rPr>
-        <w:t>The frontend is implemented as a React Single Page Application using TypeScript for type safety. Key implementation aspects include:</w:t>
+        <w:t>The frontend is implemented as a React Single Page Application using TypeScript [8] for type safety. Key implementation aspects include:</w:t>
       </w:r>
     </w:p>
     <w:p>
@@ -18346,7 +18334,7 @@
           <w:color w:val="000000"/>
           <w:sz w:val="24"/>
         </w:rPr>
-        <w:t>Data Visualization: Recharts renders time-series charts for CPU utilization, memory usage, pod restart counts, and network I/O metrics.</w:t>
+        <w:t>Data Visualization: Recharts renders time-series charts [8] for CPU utilization, memory usage, pod restart counts, and network I/O metrics.</w:t>
       </w:r>
     </w:p>
     <w:p>
@@ -18654,7 +18642,7 @@
           <w:color w:val="000000"/>
           <w:sz w:val="24"/>
         </w:rPr>
-        <w:t>The AnomalyDetector class implements the Isolation Forest algorithm using scikit-learn. Key implementation details:</w:t>
+        <w:t>The AnomalyDetector class implements the Isolation Forest algorithm using scikit-learn [9]. Key implementation details:</w:t>
       </w:r>
     </w:p>
     <w:p>
@@ -18724,7 +18712,7 @@
           <w:color w:val="000000"/>
           <w:sz w:val="24"/>
         </w:rPr>
-        <w:t>Fallback Mode: When scikit-learn is unavailable, a rule-based detection method (_demo_detect) provides basic threshold checking for CPU (&gt;90%), memory (&gt;95%), and pod restarts (&gt;5).</w:t>
+        <w:t>Fallback Mode: When scikit-learn [9] is unavailable, a rule-based detection method (_demo_detect) provides basic threshold checking for CPU (&gt;90%), memory (&gt;95%), and pod restarts (&gt;5).</w:t>
       </w:r>
     </w:p>
     <w:p>
@@ -18763,7 +18751,7 @@
         <w:br/>
         <w:t xml:space="preserve">        self.model = IsolationForest(</w:t>
         <w:br/>
-        <w:t xml:space="preserve">            contamination=0.1, n_estimators=100,</w:t>
+        <w:t xml:space="preserve">            contamination=0.1, n_estimators=100 [3],</w:t>
         <w:br/>
         <w:t xml:space="preserve">            max_samples='auto', random_state=42)</w:t>
         <w:br/>
@@ -19381,7 +19369,7 @@
           <w:i w:val="0"/>
           <w:sz w:val="24"/>
         </w:rPr>
-        <w:t>The Docker deployment configuration uses environment variables for runtime configuration, allowing the same container images to be used across development, staging, and production environments. Key configuration parameters include the database URL, JWT secret key, encryption key for cluster credentials, CORS origins whitelist, and Kubernetes connection settings.</w:t>
+        <w:t>The Docker deployment configuration [10] uses environment variables for runtime configuration, allowing the same container images to be used across development, staging, and production environments. Key configuration parameters include the database URL, JWT secret key, encryption key for cluster credentials, CORS origins whitelist, and Kubernetes connection settings.</w:t>
       </w:r>
     </w:p>
     <w:p>
@@ -19426,7 +19414,7 @@
           <w:i w:val="0"/>
           <w:sz w:val="24"/>
         </w:rPr>
-        <w:t>Inter-container communication uses a Docker bridge network (k8s-dashboard) that provides DNS-based service discovery. The frontend Nginx configuration proxies API requests to the backend container using the service name as hostname, eliminating the need for hardcoded IP addresses.</w:t>
+        <w:t>Inter-container communication uses a Docker bridge network [10] (k8s-dashboard) that provides DNS-based service discovery. The frontend Nginx configuration proxies API requests to the backend container using the service name as hostname, eliminating the need for hardcoded IP addresses.</w:t>
       </w:r>
     </w:p>
     <w:p/>
@@ -19492,7 +19480,7 @@
           <w:i w:val="0"/>
           <w:sz w:val="24"/>
         </w:rPr>
-        <w:t>API testing was performed using both automated scripts and manual verification with the FastAPI Swagger UI (auto-generated at /docs). Each endpoint was tested for correct HTTP status codes, response payload structure, authentication enforcement, and error handling behavior.</w:t>
+        <w:t>API testing was performed using both automated scripts and manual verification with the FastAPI Swagger UI (auto-generated at /docs) [7]. Each endpoint was tested for correct HTTP status codes, response payload structure, authentication enforcement, and error handling behavior.</w:t>
       </w:r>
     </w:p>
     <w:p>
@@ -23039,7 +23027,7 @@
           <w:color w:val="000000"/>
           <w:sz w:val="24"/>
         </w:rPr>
-        <w:t>(3) Integration of the Isolation Forest unsupervised machine learning algorithm for automatic anomaly detection in cluster metrics, with z-score based factor analysis.</w:t>
+        <w:t>(3) Integration of the Isolation Forest unsupervised machine learning algorithm [3][4] for automatic anomaly detection in cluster metrics, with z-score based factor analysis.</w:t>
       </w:r>
     </w:p>
     <w:p>
@@ -23053,7 +23041,7 @@
           <w:color w:val="000000"/>
           <w:sz w:val="24"/>
         </w:rPr>
-        <w:t>(4) A clean, modern three-tier architecture using React/TypeScript, FastAPI, and SQLAlchemy with containerized deployment via Docker Compose.</w:t>
+        <w:t>(4) A clean, modern three-tier architecture using React/TypeScript, FastAPI, and SQLAlchemy with containerized deployment via Docker Compose [10].</w:t>
       </w:r>
     </w:p>
     <w:p>
@@ -23522,6 +23510,76 @@
       </w:r>
     </w:p>
     <w:p>
+      <w:pPr>
+        <w:spacing w:after="80"/>
+        <w:ind w:left="720" w:hanging="720"/>
+      </w:pPr>
+      <w:r>
+        <w:rPr>
+          <w:rFonts w:ascii="Times New Roman" w:hAnsi="Times New Roman"/>
+          <w:color w:val="000000"/>
+          <w:sz w:val="22"/>
+        </w:rPr>
+        <w:t xml:space="preserve">[16] Chandola, V., Banerjee, A., &amp; Kumar, V. (2009). Anomaly Detection: A Survey. ACM Computing Surveys, 41(3), Article 15.</w:t>
+      </w:r>
+    </w:p>
+    <w:p>
+      <w:pPr>
+        <w:spacing w:after="80"/>
+        <w:ind w:left="720" w:hanging="720"/>
+      </w:pPr>
+      <w:r>
+        <w:rPr>
+          <w:rFonts w:ascii="Times New Roman" w:hAnsi="Times New Roman"/>
+          <w:color w:val="000000"/>
+          <w:sz w:val="22"/>
+        </w:rPr>
+        <w:t xml:space="preserve">[17] Verma, A., Pedrosa, L., Korupolu, M., Oppenheimer, D., Tune, E., &amp; Wilkes, J. (2015). Large-scale Cluster Management at Google with Borg. In Proceedings of the 10th European Conference on Computer Systems (EuroSys '15), pp. 1-17.</w:t>
+      </w:r>
+    </w:p>
+    <w:p>
+      <w:pPr>
+        <w:spacing w:after="80"/>
+        <w:ind w:left="720" w:hanging="720"/>
+      </w:pPr>
+      <w:r>
+        <w:rPr>
+          <w:rFonts w:ascii="Times New Roman" w:hAnsi="Times New Roman"/>
+          <w:color w:val="000000"/>
+          <w:sz w:val="22"/>
+        </w:rPr>
+        <w:t xml:space="preserve">[18] Richardson, C. (2018). Microservices Patterns: With Examples in Java. Manning Publications.</w:t>
+      </w:r>
+    </w:p>
+    <w:p>
+      <w:pPr>
+        <w:spacing w:after="80"/>
+        <w:ind w:left="720" w:hanging="720"/>
+      </w:pPr>
+      <w:r>
+        <w:rPr>
+          <w:rFonts w:ascii="Times New Roman" w:hAnsi="Times New Roman"/>
+          <w:color w:val="000000"/>
+          <w:sz w:val="22"/>
+        </w:rPr>
+        <w:t xml:space="preserve">[19] Fielding, R. T. (2000). Architectural Styles and the Design of Network-Based Software Architectures. Doctoral dissertation, University of California, Irvine.</w:t>
+      </w:r>
+    </w:p>
+    <w:p>
+      <w:pPr>
+        <w:spacing w:after="80"/>
+        <w:ind w:left="720" w:hanging="720"/>
+      </w:pPr>
+      <w:r>
+        <w:rPr>
+          <w:rFonts w:ascii="Times New Roman" w:hAnsi="Times New Roman"/>
+          <w:color w:val="000000"/>
+          <w:sz w:val="22"/>
+        </w:rPr>
+        <w:t xml:space="preserve">[20] Aggarwal, C. C. (2017). Outlier Analysis (2nd ed.). Springer International Publishing.</w:t>
+      </w:r>
+    </w:p>
+    <w:p>
       <w:r>
         <w:br w:type="page"/>
       </w:r>
@@ -23559,7 +23617,7 @@
           <w:color w:val="000000"/>
           <w:sz w:val="24"/>
         </w:rPr>
-        <w:t>I would also like to thank the open-source communities behind Kubernetes, FastAPI, React, scikit-learn, and the many other tools and libraries that form the foundation of this project. Their contributions to the field of software engineering have been invaluable.</w:t>
+        <w:t>I would also like to thank the open-source communities behind Kubernetes, FastAPI, React, scikit-learn [9], and the many other tools and libraries that form the foundation of this project. Their contributions to the field of software engineering have been invaluable.</w:t>
       </w:r>
     </w:p>
     <w:p>

</xml_diff>

<commit_message>
Redesign all diagrams (clean B&W), remove code snippets, add 5 new references [21]-[25]
Agent-Logs-Url: https://github.com/oussamaes1/k8s-dashboard/sessions/72ee8985-778e-47fe-8cdf-5efca395bfbe

Co-authored-by: oussamaes1 <80717161+oussamaes1@users.noreply.github.com>
</commit_message>
<xml_diff>
--- a/Graduation_Thesis_Second_Draft.docx
+++ b/Graduation_Thesis_Second_Draft.docx
@@ -219,7 +219,7 @@
           <w:color w:val="000000"/>
           <w:sz w:val="24"/>
         </w:rPr>
-        <w:t>As cloud-native technologies become the backbone of modern software infrastructure, Kubernetes has emerged as the de facto standard for container orchestration [1]. However, the inherent complexity of managing distributed Kubernetes clusters presents significant challenges for DevOps engineers, particularly in the areas of real-time monitoring, log aggregation, and anomaly detection. This thesis presents the design and implementation of a comprehensive web-based dashboard for Kubernetes cluster monitoring and management. The system integrates a React/TypeScript frontend with a Python/FastAPI backend, providing a unified platform for multi-cluster management, real-time metrics visualization, centralized log aggregation, and AI-powered anomaly detection using the Isolation Forest algorithm.</w:t>
+        <w:t>As cloud-native technologies become the backbone of modern software infrastructure, Kubernetes has emerged as the de facto standard for container orchestration [25] [1]. However, the inherent complexity of managing distributed Kubernetes clusters presents significant challenges for DevOps engineers, particularly in the areas of real-time monitoring, log aggregation, and anomaly detection. This thesis presents the design and implementation of a comprehensive web-based dashboard for Kubernetes cluster monitoring and management. The system integrates a React/TypeScript frontend with a Python/FastAPI backend, providing a unified platform for multi-cluster management, real-time metrics visualization, centralized log aggregation, and AI-powered anomaly detection using the Isolation Forest algorithm.</w:t>
       </w:r>
     </w:p>
     <w:p>
@@ -233,7 +233,7 @@
           <w:color w:val="000000"/>
           <w:sz w:val="24"/>
         </w:rPr>
-        <w:t>The dashboard features multi-user role-based access control (RBAC), encrypted credential storage using Fernet symmetric encryption, comprehensive audit logging, and namespace-level resource isolation. The system architecture follows a three-tier design pattern with containerized deployment via Docker Compose [10]. The anomaly detection module employs an unsupervised machine learning approach to identify unusual patterns in cluster metrics without requiring labeled training data. Experimental evaluation demonstrates that the system successfully provides a cohesive monitoring experience while reducing the cognitive overhead traditionally associated with Kubernetes cluster management.</w:t>
+        <w:t>The dashboard features multi-user role-based access control (RBAC), encrypted credential storage using Fernet symmetric encryption, comprehensive audit logging, and namespace-level resource isolation. The system architecture follows a three-tier design pattern with containerized deployment via Docker Compose [10]. The anomaly detection module employs an unsupervised machine learning approach to identify unusual patterns [21] in cluster metrics without requiring labeled training data. Experimental evaluation demonstrates that the system successfully provides a cohesive monitoring experience while reducing the cognitive overhead traditionally associated with Kubernetes cluster management.</w:t>
       </w:r>
     </w:p>
     <w:p>
@@ -401,7 +401,7 @@
           <w:rFonts w:ascii="Times New Roman" w:hAnsi="Times New Roman"/>
           <w:sz w:val="24"/>
         </w:rPr>
-        <w:t>Figure 5.1  FastAPI Application Initialization Code</w:t>
+        <w:t>The FastAPI application entry point configures CORS middleware with permitted origins, registers the JWT authentication, user context, and cluster isolation middleware in sequence, and includes all API route modules for authentication, cluster management, monitoring, metrics, logs, alerts, and audit endpoints.</w:t>
       </w:r>
     </w:p>
     <w:p>
@@ -413,7 +413,7 @@
           <w:rFonts w:ascii="Times New Roman" w:hAnsi="Times New Roman"/>
           <w:sz w:val="24"/>
         </w:rPr>
-        <w:t>Figure 5.2  JWT Token Generation and Verification Code</w:t>
+        <w:t>The authentication module implements JWT token generation using the PyJWT library with HS256 signing. The create_access_token function encodes the username and role into the token payload with a configurable expiration time. The verify_token function decodes and validates incoming tokens, extracting user claims for downstream middleware.</w:t>
       </w:r>
     </w:p>
     <w:p>
@@ -425,7 +425,7 @@
           <w:rFonts w:ascii="Times New Roman" w:hAnsi="Times New Roman"/>
           <w:sz w:val="24"/>
         </w:rPr>
-        <w:t>Figure 5.3  Frontend API Client with Authentication Interceptors</w:t>
+        <w:t>The frontend API client is built on Axios with two interceptors: a request interceptor that attaches the JWT token from the Zustand authentication store to every outgoing request header, and a response interceptor that detects HTTP 401 responses and automatically redirects the user to the login page when the token expires.</w:t>
       </w:r>
     </w:p>
     <w:p>
@@ -485,7 +485,7 @@
           <w:rFonts w:ascii="Times New Roman" w:hAnsi="Times New Roman"/>
           <w:sz w:val="24"/>
         </w:rPr>
-        <w:t>Figure 5.8  Isolation Forest Anomaly Detection Implementation</w:t>
+        <w:t>The AnomalyDetector class initializes an Isolation Forest model with 100 estimators and a contamination parameter of 0.1. When sufficient training data is collected (minimum 50 samples), the model is fitted on StandardScaler-normalized feature vectors. During detection, each new metric vector is scored using the decision_function, and the raw score is converted to a normalized anomaly score.</w:t>
       </w:r>
     </w:p>
     <w:p>
@@ -1433,7 +1433,7 @@
           <w:color w:val="000000"/>
           <w:sz w:val="24"/>
         </w:rPr>
-        <w:t>The rapid adoption of cloud-native technologies has fundamentally transformed how modern software systems are built, deployed, and managed. At the core of this transformation is Kubernetes, an open-source container orchestration platform originally developed by Google and now maintained by the Cloud Native Computing Foundation (CNCF). According to the CNCF Annual Survey 2024, approximately 96% of organizations are either using or evaluating Kubernetes, making it the industry standard for container orchestration.</w:t>
+        <w:t>The rapid adoption of cloud-native technologies has fundamentally transformed how modern software systems are built, deployed, and managed. At the core of this transformation is Kubernetes, an open-source container orchestration [25] platform originally developed by Google and now maintained by the Cloud Native Computing Foundation (CNCF). According to the CNCF Annual Survey 2024, approximately 96% of organizations are either using or evaluating Kubernetes, making it the industry standard for container orchestration.</w:t>
       </w:r>
     </w:p>
     <w:p>
@@ -1476,7 +1476,7 @@
           <w:i w:val="0"/>
           <w:sz w:val="24"/>
         </w:rPr>
-        <w:t>Recent industry reports indicate that the global container orchestration market is projected to reach $6.4 billion by 2028, driven by increased enterprise adoption of microservices [18] architectures and DevOps practices. This growth has created an urgent need for monitoring solutions that can scale with infrastructure complexity while remaining accessible to operations teams of varying skill levels.</w:t>
+        <w:t>Recent industry reports indicate that the global container orchestration [25] market is projected to reach $6.4 billion by 2028, driven by increased enterprise adoption of microservices [18] architecture [22]s and DevOps practices. This growth has created an urgent need for monitoring solutions that can scale with infrastructure complexity while remaining accessible to operations teams of varying skill levels.</w:t>
       </w:r>
     </w:p>
     <w:p>
@@ -1860,7 +1860,7 @@
           <w:color w:val="000000"/>
           <w:sz w:val="24"/>
         </w:rPr>
-        <w:t>Cloud-native computing refers to an approach to building and running applications that fully exploits the advantages of cloud computing delivery models. The Cloud Native Computing Foundation (CNCF) defines [2] cloud-native technologies as those that "empower organizations to build and run scalable applications in modern, dynamic environments such as public, private, and hybrid clouds." Key characteristics include containerization, microservices [18] architecture, dynamic orchestration, and declarative APIs.</w:t>
+        <w:t>Cloud-native computing refers to an approach to building and running applications that fully exploits the advantages of cloud computing delivery models. The Cloud Native Computing Foundation (CNCF) defines [2] cloud-native technologies as those that "empower organizations to build and run scalable applications in modern, dynamic environments such as public, private, and hybrid clouds." Key characteristics include containerization, microservices [18] architecture [22], dynamic orchestration, and declarative APIs.</w:t>
       </w:r>
     </w:p>
     <w:p>
@@ -2062,7 +2062,7 @@
           <w:color w:val="000000"/>
           <w:sz w:val="24"/>
         </w:rPr>
-        <w:t>In the context of Kubernetes monitoring, anomaly detection aims to identify unusual patterns [16] in cluster metrics that may indicate problems such as resource exhaustion, failing pods, or performance degradation. Two main approaches exist: supervised learning (requiring labeled historical data of normal vs. abnormal behavior) and unsupervised learning (detecting deviations from normal patterns without labels).</w:t>
+        <w:t>In the context of Kubernetes monitoring, anomaly detection aims to identify unusual patterns [21] [16] in cluster metrics that may indicate problems such as resource exhaustion, failing pods, or performance degradation. Two main approaches exist: supervised learning (requiring labeled historical data of normal vs. abnormal behavior) and unsupervised learning (detecting deviations from normal patterns without labels).</w:t>
       </w:r>
     </w:p>
     <w:p>
@@ -2076,7 +2076,7 @@
           <w:color w:val="000000"/>
           <w:sz w:val="24"/>
         </w:rPr>
-        <w:t>Unsupervised approaches are particularly valuable for infrastructure monitoring [16][20] because labeled anomaly data is scarce, and the definition of "anomalous" varies across environments. The Isolation Forest algorithm has emerged as a leading choice for this application due to its efficiency, scalability, and ability to handle high-dimensional data.</w:t>
+        <w:t>Unsupervised approaches are particularly valuable for infrastructure monitoring [16][20] because labeled anomaly data is scarce [24], and the definition of "anomalous" varies across environments. The Isolation Forest algorithm has emerged as a leading choice for this application due to its efficiency, scalability, and ability to handle high-dimensional data.</w:t>
       </w:r>
     </w:p>
     <w:p>
@@ -2126,7 +2126,7 @@
           <w:color w:val="000000"/>
           <w:sz w:val="24"/>
         </w:rPr>
-        <w:t>The key advantages of Isolation Forest include: (1) linear time complexity O(n), making it suitable for real-time detection; (2) low memory requirements; (3) no need for distance or density measures; and (4) effective performance in high-dimensional spaces. These properties make it well-suited for monitoring Kubernetes cluster metrics in real-time.</w:t>
+        <w:t>The key advantages of Isolation Forest include: (1) linear time complexity O(n), making it suitable for real-time detection; (2) low memory requirements; (3) no need for distance or density measures [23]; and (4) effective performance in high-dimensional spaces. These properties make it well-suited for monitoring Kubernetes cluster metrics in real-time.</w:t>
       </w:r>
     </w:p>
     <w:p>
@@ -4061,8 +4061,8 @@
       <w:r>
         <w:drawing>
           <wp:inline xmlns:a="http://schemas.openxmlformats.org/drawingml/2006/main" xmlns:pic="http://schemas.openxmlformats.org/drawingml/2006/picture">
-            <wp:extent cx="5486400" cy="3657600"/>
-            <wp:docPr id="7" name="Picture 7"/>
+            <wp:extent cx="5029200" cy="3771900"/>
+            <wp:docPr id="1" name="Picture 1"/>
             <wp:cNvGraphicFramePr>
               <a:graphicFrameLocks noChangeAspect="1"/>
             </wp:cNvGraphicFramePr>
@@ -4074,7 +4074,7 @@
                     <pic:cNvPicPr/>
                   </pic:nvPicPr>
                   <pic:blipFill>
-                    <a:blip r:embed="rId15"/>
+                    <a:blip r:embed="rId21"/>
                     <a:stretch>
                       <a:fillRect/>
                     </a:stretch>
@@ -4082,7 +4082,7 @@
                   <pic:spPr>
                     <a:xfrm>
                       <a:off x="0" y="0"/>
-                      <a:ext cx="5486400" cy="3657600"/>
+                      <a:ext cx="5029200" cy="3771900"/>
                     </a:xfrm>
                     <a:prstGeom prst="rect"/>
                   </pic:spPr>
@@ -6885,8 +6885,8 @@
       <w:r>
         <w:drawing>
           <wp:inline xmlns:a="http://schemas.openxmlformats.org/drawingml/2006/main" xmlns:pic="http://schemas.openxmlformats.org/drawingml/2006/picture">
-            <wp:extent cx="5486400" cy="3429000"/>
-            <wp:docPr id="8" name="Picture 8"/>
+            <wp:extent cx="5029200" cy="3562350"/>
+            <wp:docPr id="2" name="Picture 2"/>
             <wp:cNvGraphicFramePr>
               <a:graphicFrameLocks noChangeAspect="1"/>
             </wp:cNvGraphicFramePr>
@@ -6898,7 +6898,7 @@
                     <pic:cNvPicPr/>
                   </pic:nvPicPr>
                   <pic:blipFill>
-                    <a:blip r:embed="rId16"/>
+                    <a:blip r:embed="rId22"/>
                     <a:stretch>
                       <a:fillRect/>
                     </a:stretch>
@@ -6906,7 +6906,7 @@
                   <pic:spPr>
                     <a:xfrm>
                       <a:off x="0" y="0"/>
-                      <a:ext cx="5486400" cy="3429000"/>
+                      <a:ext cx="5029200" cy="3562350"/>
                     </a:xfrm>
                     <a:prstGeom prst="rect"/>
                   </pic:spPr>
@@ -8394,8 +8394,8 @@
       <w:r>
         <w:drawing>
           <wp:inline xmlns:a="http://schemas.openxmlformats.org/drawingml/2006/main" xmlns:pic="http://schemas.openxmlformats.org/drawingml/2006/picture">
-            <wp:extent cx="5486400" cy="4114800"/>
-            <wp:docPr id="9" name="Picture 9"/>
+            <wp:extent cx="5029200" cy="3352800"/>
+            <wp:docPr id="3" name="Picture 3"/>
             <wp:cNvGraphicFramePr>
               <a:graphicFrameLocks noChangeAspect="1"/>
             </wp:cNvGraphicFramePr>
@@ -8407,7 +8407,7 @@
                     <pic:cNvPicPr/>
                   </pic:nvPicPr>
                   <pic:blipFill>
-                    <a:blip r:embed="rId17"/>
+                    <a:blip r:embed="rId23"/>
                     <a:stretch>
                       <a:fillRect/>
                     </a:stretch>
@@ -8415,7 +8415,7 @@
                   <pic:spPr>
                     <a:xfrm>
                       <a:off x="0" y="0"/>
-                      <a:ext cx="5486400" cy="4114800"/>
+                      <a:ext cx="5029200" cy="3352800"/>
                     </a:xfrm>
                     <a:prstGeom prst="rect"/>
                   </pic:spPr>
@@ -17206,8 +17206,8 @@
       <w:r>
         <w:drawing>
           <wp:inline xmlns:a="http://schemas.openxmlformats.org/drawingml/2006/main" xmlns:pic="http://schemas.openxmlformats.org/drawingml/2006/picture">
-            <wp:extent cx="5486400" cy="3200400"/>
-            <wp:docPr id="10" name="Picture 10"/>
+            <wp:extent cx="5029200" cy="2933700"/>
+            <wp:docPr id="4" name="Picture 4"/>
             <wp:cNvGraphicFramePr>
               <a:graphicFrameLocks noChangeAspect="1"/>
             </wp:cNvGraphicFramePr>
@@ -17219,7 +17219,7 @@
                     <pic:cNvPicPr/>
                   </pic:nvPicPr>
                   <pic:blipFill>
-                    <a:blip r:embed="rId20"/>
+                    <a:blip r:embed="rId24"/>
                     <a:stretch>
                       <a:fillRect/>
                     </a:stretch>
@@ -17227,7 +17227,7 @@
                   <pic:spPr>
                     <a:xfrm>
                       <a:off x="0" y="0"/>
-                      <a:ext cx="5486400" cy="3200400"/>
+                      <a:ext cx="5029200" cy="2933700"/>
                     </a:xfrm>
                     <a:prstGeom prst="rect"/>
                   </pic:spPr>
@@ -17454,8 +17454,8 @@
       <w:r>
         <w:drawing>
           <wp:inline xmlns:a="http://schemas.openxmlformats.org/drawingml/2006/main" xmlns:pic="http://schemas.openxmlformats.org/drawingml/2006/picture">
-            <wp:extent cx="5486400" cy="3200400"/>
-            <wp:docPr id="11" name="Picture 11"/>
+            <wp:extent cx="5029200" cy="3200400"/>
+            <wp:docPr id="5" name="Picture 5"/>
             <wp:cNvGraphicFramePr>
               <a:graphicFrameLocks noChangeAspect="1"/>
             </wp:cNvGraphicFramePr>
@@ -17467,7 +17467,7 @@
                     <pic:cNvPicPr/>
                   </pic:nvPicPr>
                   <pic:blipFill>
-                    <a:blip r:embed="rId19"/>
+                    <a:blip r:embed="rId25"/>
                     <a:stretch>
                       <a:fillRect/>
                     </a:stretch>
@@ -17475,7 +17475,7 @@
                   <pic:spPr>
                     <a:xfrm>
                       <a:off x="0" y="0"/>
-                      <a:ext cx="5486400" cy="3200400"/>
+                      <a:ext cx="5029200" cy="3200400"/>
                     </a:xfrm>
                     <a:prstGeom prst="rect"/>
                   </pic:spPr>
@@ -18016,49 +18016,7 @@
           <w:i w:val="0"/>
           <w:sz w:val="24"/>
         </w:rPr>
-        <w:t>The following code excerpt shows the core FastAPI application initialization with middleware registration and route inclusion:</w:t>
-      </w:r>
-    </w:p>
-    <w:p>
-      <w:pPr>
-        <w:pStyle w:val="Normal"/>
-        <w:spacing w:before="80" w:after="80"/>
-        <w:ind w:firstLine="0" w:left="720"/>
-        <w:shd w:val="clear" w:color="auto" w:fill="F5F5F5"/>
-        <w:pBdr>
-          <w:left w:val="single" w:sz="4" w:space="4" w:color="CCCCCC"/>
-        </w:pBdr>
-      </w:pPr>
-      <w:r>
-        <w:rPr>
-          <w:rFonts w:ascii="Consolas" w:hAnsi="Consolas"/>
-          <w:sz w:val="18"/>
-        </w:rPr>
-        <w:t>app = FastAPI(title="K8s Dashboard API", version="1.0.0")</w:t>
-        <w:br/>
-        <w:br/>
-        <w:t># Middleware pipeline</w:t>
-        <w:br/>
-        <w:t>app.add_middleware(CORSMiddleware, allow_origins=settings.cors_origins,</w:t>
-        <w:br/>
-        <w:t xml:space="preserve">    allow_credentials=True, allow_methods=["*"], allow_headers=["*"])</w:t>
-        <w:br/>
-        <w:br/>
-        <w:t># Register API routes</w:t>
-        <w:br/>
-        <w:t>app.include_router(auth_router, prefix="/api/v1/auth", tags=["auth"])</w:t>
-        <w:br/>
-        <w:t>app.include_router(cluster_router, prefix="/api/v1/cluster", tags=["cluster"])</w:t>
-        <w:br/>
-        <w:t>app.include_router(clusters_router, prefix="/api/v1/clusters", tags=["clusters"])</w:t>
-        <w:br/>
-        <w:t>app.include_router(metrics_router, prefix="/api/v1/metrics", tags=["metrics"])</w:t>
-        <w:br/>
-        <w:t>app.include_router(alerts_router, prefix="/api/v1/alerts", tags=["alerts"])</w:t>
-        <w:br/>
-        <w:t>app.include_router(logs_router, prefix="/api/v1/logs", tags=["logs"])</w:t>
-        <w:br/>
-        <w:t>app.include_router(namespaces_router, prefix="/api/v1/namespaces", tags=["namespaces"])</w:t>
+        <w:t>The core FastAPI application initialization configures the middleware pipeline and registers all route modules:</w:t>
       </w:r>
     </w:p>
     <w:p>
@@ -18074,7 +18032,7 @@
           <w:i w:val="0"/>
           <w:sz w:val="20"/>
         </w:rPr>
-        <w:t>Figure 5.1  FastAPI Application Initialization Code</w:t>
+        <w:t>The FastAPI application entry point configures CORS middleware with permitted origins, registers the JWT authentication, user context, and cluster isolation middleware in sequence, and includes all API route modules for authentication, cluster management, monitoring, metrics, logs, alerts, and audit endpoints.</w:t>
       </w:r>
     </w:p>
     <w:p>
@@ -18089,48 +18047,7 @@
           <w:i w:val="0"/>
           <w:sz w:val="24"/>
         </w:rPr>
-        <w:t>The authentication implementation uses PyJWT for token generation and bcrypt for password verification. Figure 5.2 shows the core authentication logic:</w:t>
-      </w:r>
-    </w:p>
-    <w:p>
-      <w:pPr>
-        <w:pStyle w:val="Normal"/>
-        <w:spacing w:before="80" w:after="80"/>
-        <w:ind w:firstLine="0" w:left="720"/>
-        <w:shd w:val="clear" w:color="auto" w:fill="F5F5F5"/>
-        <w:pBdr>
-          <w:left w:val="single" w:sz="4" w:space="4" w:color="CCCCCC"/>
-        </w:pBdr>
-      </w:pPr>
-      <w:r>
-        <w:rPr>
-          <w:rFonts w:ascii="Consolas" w:hAnsi="Consolas"/>
-          <w:sz w:val="18"/>
-        </w:rPr>
-        <w:t>def create_access_token(data: dict) -&gt; str:</w:t>
-        <w:br/>
-        <w:t xml:space="preserve">    to_encode = data.copy()</w:t>
-        <w:br/>
-        <w:t xml:space="preserve">    expire = datetime.utcnow() + timedelta(minutes=settings.token_expire)</w:t>
-        <w:br/>
-        <w:t xml:space="preserve">    to_encode.update({"exp": expire, "iat": datetime.utcnow()})</w:t>
-        <w:br/>
-        <w:t xml:space="preserve">    return jwt.encode(to_encode, settings.secret_key, algorithm="HS256")</w:t>
-        <w:br/>
-        <w:br/>
-        <w:t>async def get_current_user(token: str = Depends(oauth2_scheme)):</w:t>
-        <w:br/>
-        <w:t xml:space="preserve">    payload = jwt.decode(token, settings.secret_key, algorithms=["HS256"])</w:t>
-        <w:br/>
-        <w:t xml:space="preserve">    username = payload.get("sub")</w:t>
-        <w:br/>
-        <w:t xml:space="preserve">    user = db.query(User).filter(User.username == username).first()</w:t>
-        <w:br/>
-        <w:t xml:space="preserve">    if not user or not user.is_active:</w:t>
-        <w:br/>
-        <w:t xml:space="preserve">        raise HTTPException(status_code=401, detail="Invalid credentials")</w:t>
-        <w:br/>
-        <w:t xml:space="preserve">    return user</w:t>
+        <w:t>The authentication implementation uses PyJWT for token generation and bcrypt for password verification:</w:t>
       </w:r>
     </w:p>
     <w:p>
@@ -18146,7 +18063,7 @@
           <w:i w:val="0"/>
           <w:sz w:val="20"/>
         </w:rPr>
-        <w:t>Figure 5.2  JWT Token Generation and Verification Code</w:t>
+        <w:t>The authentication module implements JWT token generation using the PyJWT library with HS256 signing. The create_access_token function encodes the username and role into the token payload with a configurable expiration time. The verify_token function decodes and validates incoming tokens, extracting user claims for downstream middleware.</w:t>
       </w:r>
     </w:p>
     <w:p>
@@ -18204,8 +18121,8 @@
       <w:r>
         <w:drawing>
           <wp:inline xmlns:a="http://schemas.openxmlformats.org/drawingml/2006/main" xmlns:pic="http://schemas.openxmlformats.org/drawingml/2006/picture">
-            <wp:extent cx="5486400" cy="3429000"/>
-            <wp:docPr id="12" name="Picture 12"/>
+            <wp:extent cx="5029200" cy="3657600"/>
+            <wp:docPr id="6" name="Picture 6"/>
             <wp:cNvGraphicFramePr>
               <a:graphicFrameLocks noChangeAspect="1"/>
             </wp:cNvGraphicFramePr>
@@ -18217,7 +18134,7 @@
                     <pic:cNvPicPr/>
                   </pic:nvPicPr>
                   <pic:blipFill>
-                    <a:blip r:embed="rId18"/>
+                    <a:blip r:embed="rId26"/>
                     <a:stretch>
                       <a:fillRect/>
                     </a:stretch>
@@ -18225,7 +18142,7 @@
                   <pic:spPr>
                     <a:xfrm>
                       <a:off x="0" y="0"/>
-                      <a:ext cx="5486400" cy="3429000"/>
+                      <a:ext cx="5029200" cy="3657600"/>
                     </a:xfrm>
                     <a:prstGeom prst="rect"/>
                   </pic:spPr>
@@ -18349,61 +18266,7 @@
           <w:i w:val="0"/>
           <w:sz w:val="24"/>
         </w:rPr>
-        <w:t>The frontend API client centralizes all HTTP communication through an Axios instance with request and response interceptors. Figure 5.3 shows the API client configuration:</w:t>
-      </w:r>
-    </w:p>
-    <w:p>
-      <w:pPr>
-        <w:pStyle w:val="Normal"/>
-        <w:spacing w:before="80" w:after="80"/>
-        <w:ind w:firstLine="0" w:left="720"/>
-        <w:shd w:val="clear" w:color="auto" w:fill="F5F5F5"/>
-        <w:pBdr>
-          <w:left w:val="single" w:sz="4" w:space="4" w:color="CCCCCC"/>
-        </w:pBdr>
-      </w:pPr>
-      <w:r>
-        <w:rPr>
-          <w:rFonts w:ascii="Consolas" w:hAnsi="Consolas"/>
-          <w:sz w:val="18"/>
-        </w:rPr>
-        <w:t>const api = axios.create({ baseURL: '/api/v1' });</w:t>
-        <w:br/>
-        <w:br/>
-        <w:t>api.interceptors.request.use((config) =&gt; {</w:t>
-        <w:br/>
-        <w:t xml:space="preserve">  const token = useAuthStore.getState().token;</w:t>
-        <w:br/>
-        <w:t xml:space="preserve">  if (token) config.headers.Authorization = `Bearer ${token}`;</w:t>
-        <w:br/>
-        <w:t xml:space="preserve">  const clusterId = useClusterStore.getState().selectedClusterId;</w:t>
-        <w:br/>
-        <w:t xml:space="preserve">  if (clusterId) config.params = { ...config.params, cluster_id: clusterId };</w:t>
-        <w:br/>
-        <w:t xml:space="preserve">  return config;</w:t>
-        <w:br/>
-        <w:t>});</w:t>
-        <w:br/>
-        <w:br/>
-        <w:t>api.interceptors.response.use(</w:t>
-        <w:br/>
-        <w:t xml:space="preserve">  (response) =&gt; response,</w:t>
-        <w:br/>
-        <w:t xml:space="preserve">  (error) =&gt; {</w:t>
-        <w:br/>
-        <w:t xml:space="preserve">    if (error.response?.status === 401) {</w:t>
-        <w:br/>
-        <w:t xml:space="preserve">      useAuthStore.getState().logout();</w:t>
-        <w:br/>
-        <w:t xml:space="preserve">      window.location.href = '/login';</w:t>
-        <w:br/>
-        <w:t xml:space="preserve">    }</w:t>
-        <w:br/>
-        <w:t xml:space="preserve">    return Promise.reject(error);</w:t>
-        <w:br/>
-        <w:t xml:space="preserve">  }</w:t>
-        <w:br/>
-        <w:t>);</w:t>
+        <w:t>The frontend API client centralizes all HTTP communication through an Axios instance with request and response interceptors:</w:t>
       </w:r>
     </w:p>
     <w:p>
@@ -18419,7 +18282,7 @@
           <w:i w:val="0"/>
           <w:sz w:val="20"/>
         </w:rPr>
-        <w:t>Figure 5.3  Frontend API Client with Authentication Interceptors</w:t>
+        <w:t>The frontend API client is built on Axios with two interceptors: a request interceptor that attaches the JWT token from the Zustand authentication store to every outgoing request header, and a response interceptor that detects HTTP 401 responses and automatically redirects the user to the login page when the token expires.</w:t>
       </w:r>
     </w:p>
     <w:p>
@@ -18727,64 +18590,7 @@
           <w:i w:val="0"/>
           <w:sz w:val="24"/>
         </w:rPr>
-        <w:t>Figure 5.8 shows the core anomaly detection implementation:</w:t>
-      </w:r>
-    </w:p>
-    <w:p>
-      <w:pPr>
-        <w:pStyle w:val="Normal"/>
-        <w:spacing w:before="80" w:after="80"/>
-        <w:ind w:firstLine="0" w:left="720"/>
-        <w:shd w:val="clear" w:color="auto" w:fill="F5F5F5"/>
-        <w:pBdr>
-          <w:left w:val="single" w:sz="4" w:space="4" w:color="CCCCCC"/>
-        </w:pBdr>
-      </w:pPr>
-      <w:r>
-        <w:rPr>
-          <w:rFonts w:ascii="Consolas" w:hAnsi="Consolas"/>
-          <w:sz w:val="18"/>
-        </w:rPr>
-        <w:t>class AnomalyDetector:</w:t>
-        <w:br/>
-        <w:t xml:space="preserve">    def __init__(self):</w:t>
-        <w:br/>
-        <w:t xml:space="preserve">        self.model = IsolationForest(</w:t>
-        <w:br/>
-        <w:t xml:space="preserve">            contamination=0.1, n_estimators=100 [3],</w:t>
-        <w:br/>
-        <w:t xml:space="preserve">            max_samples='auto', random_state=42)</w:t>
-        <w:br/>
-        <w:t xml:space="preserve">        self.scaler = StandardScaler()</w:t>
-        <w:br/>
-        <w:t xml:space="preserve">        self.metrics_history = deque(maxlen=1000)</w:t>
-        <w:br/>
-        <w:t xml:space="preserve">        self.anomaly_history = deque(maxlen=100)</w:t>
-        <w:br/>
-        <w:t xml:space="preserve">        self.is_trained = False</w:t>
-        <w:br/>
-        <w:br/>
-        <w:t xml:space="preserve">    def detect(self, metrics: dict) -&gt; tuple[bool, float, list]:</w:t>
-        <w:br/>
-        <w:t xml:space="preserve">        features = self._extract_features(metrics)</w:t>
-        <w:br/>
-        <w:t xml:space="preserve">        self.metrics_history.append(features)</w:t>
-        <w:br/>
-        <w:t xml:space="preserve">        if len(self.metrics_history) &gt;= 50 and not self.is_trained:</w:t>
-        <w:br/>
-        <w:t xml:space="preserve">            self.train()</w:t>
-        <w:br/>
-        <w:t xml:space="preserve">        scaled = self.scaler.transform([features])</w:t>
-        <w:br/>
-        <w:t xml:space="preserve">        prediction = self.model.predict(scaled)[0]</w:t>
-        <w:br/>
-        <w:t xml:space="preserve">        raw_score = self.model.decision_function(scaled)[0]</w:t>
-        <w:br/>
-        <w:t xml:space="preserve">        norm_score = max(0, min(1, 0.5 - raw_score))</w:t>
-        <w:br/>
-        <w:t xml:space="preserve">        factors = self._analyze_factors(features)</w:t>
-        <w:br/>
-        <w:t xml:space="preserve">        return prediction == -1, norm_score, factors</w:t>
+        <w:t>The core anomaly detection implementation is structured as follows:</w:t>
       </w:r>
     </w:p>
     <w:p>
@@ -18800,7 +18606,7 @@
           <w:i w:val="0"/>
           <w:sz w:val="20"/>
         </w:rPr>
-        <w:t>Figure 5.8  Isolation Forest Anomaly Detection Implementation</w:t>
+        <w:t>The AnomalyDetector class initializes an Isolation Forest model with 100 estimators and a contamination parameter of 0.1. When sufficient training data is collected (minimum 50 samples), the model is fitted on StandardScaler-normalized feature vectors. During detection, each new metric vector is scored using the decision_function, and the raw score is converted to a normalized anomaly score.</w:t>
       </w:r>
     </w:p>
     <w:p>
@@ -23577,6 +23383,76 @@
           <w:sz w:val="22"/>
         </w:rPr>
         <w:t xml:space="preserve">[20] Aggarwal, C. C. (2017). Outlier Analysis (2nd ed.). Springer International Publishing.</w:t>
+      </w:r>
+    </w:p>
+    <w:p>
+      <w:pPr>
+        <w:spacing w:after="80"/>
+        <w:ind w:left="720" w:hanging="720"/>
+      </w:pPr>
+      <w:r>
+        <w:rPr>
+          <w:rFonts w:ascii="Times New Roman" w:hAnsi="Times New Roman"/>
+          <w:color w:val="000000"/>
+          <w:sz w:val="22"/>
+        </w:rPr>
+        <w:t xml:space="preserve">[21] Gulenko, A., Wallschläger, M., Acker, A., Kao, O., &amp; Liu, F. (2018). Detecting Anomalous Behavior of Black-Box Services Modeled with Distance-Based Online Clustering. In IEEE International Conference on Cloud Computing (CLOUD), pp. 912-915.</w:t>
+      </w:r>
+    </w:p>
+    <w:p>
+      <w:pPr>
+        <w:spacing w:after="80"/>
+        <w:ind w:left="720" w:hanging="720"/>
+      </w:pPr>
+      <w:r>
+        <w:rPr>
+          <w:rFonts w:ascii="Times New Roman" w:hAnsi="Times New Roman"/>
+          <w:color w:val="000000"/>
+          <w:sz w:val="22"/>
+        </w:rPr>
+        <w:t xml:space="preserve">[22] Soldani, J., Tamburri, D. A., &amp; Van Den Heuvel, W. J. (2018). The Pains and Gains of Microservices: A Systematic Grey Literature Review. Journal of Systems and Software, 146, 215-232.</w:t>
+      </w:r>
+    </w:p>
+    <w:p>
+      <w:pPr>
+        <w:spacing w:after="80"/>
+        <w:ind w:left="720" w:hanging="720"/>
+      </w:pPr>
+      <w:r>
+        <w:rPr>
+          <w:rFonts w:ascii="Times New Roman" w:hAnsi="Times New Roman"/>
+          <w:color w:val="000000"/>
+          <w:sz w:val="22"/>
+        </w:rPr>
+        <w:t xml:space="preserve">[23] Breunig, M. M., Kriegel, H. P., Ng, R. T., &amp; Sander, J. (2000). LOF: Identifying Density-Based Local Outliers. In ACM SIGMOD Record, 29(2), 93-104.</w:t>
+      </w:r>
+    </w:p>
+    <w:p>
+      <w:pPr>
+        <w:spacing w:after="80"/>
+        <w:ind w:left="720" w:hanging="720"/>
+      </w:pPr>
+      <w:r>
+        <w:rPr>
+          <w:rFonts w:ascii="Times New Roman" w:hAnsi="Times New Roman"/>
+          <w:color w:val="000000"/>
+          <w:sz w:val="22"/>
+        </w:rPr>
+        <w:t xml:space="preserve">[24] Xu, H., Chen, W., Zhao, N., Li, Z., Bu, J., Li, Z., ... &amp; Pei, D. (2018). Unsupervised Anomaly Detection via Variational Auto-Encoder for Seasonal KPIs in Web Applications. In Proceedings of the 2018 World Wide Web Conference (WWW '18), pp. 187-196.</w:t>
+      </w:r>
+    </w:p>
+    <w:p>
+      <w:pPr>
+        <w:spacing w:after="80"/>
+        <w:ind w:left="720" w:hanging="720"/>
+      </w:pPr>
+      <w:r>
+        <w:rPr>
+          <w:rFonts w:ascii="Times New Roman" w:hAnsi="Times New Roman"/>
+          <w:color w:val="000000"/>
+          <w:sz w:val="22"/>
+        </w:rPr>
+        <w:t xml:space="preserve">[25] Bernstein, D. (2014). Containers and Cloud: From LXC to Docker to Kubernetes. IEEE Cloud Computing, 1(3), 81-84.</w:t>
       </w:r>
     </w:p>
     <w:p>

</xml_diff>

<commit_message>
Add 12 application screenshots with descriptions to Chapter 5 of thesis
Agent-Logs-Url: https://github.com/oussamaes1/k8s-dashboard/sessions/5b939950-41f1-42c9-a042-2df322903d92

Co-authored-by: oussamaes1 <80717161+oussamaes1@users.noreply.github.com>
</commit_message>
<xml_diff>
--- a/Graduation_Thesis_Second_Draft.docx
+++ b/Graduation_Thesis_Second_Draft.docx
@@ -698,6 +698,12 @@
       </w:r>
     </w:p>
     <w:p>
+      <w:pPr/>
+      <w:r>
+        <w:t>5.6  System Interface Demonstration</w:t>
+      </w:r>
+    </w:p>
+    <w:p>
       <w:pPr>
         <w:spacing w:after="40"/>
       </w:pPr>
@@ -1306,56 +1312,80 @@
       </w:r>
     </w:p>
     <w:p>
-      <w:pPr>
-        <w:spacing w:after="40"/>
-      </w:pPr>
       <w:r>
-        <w:rPr>
-          <w:rFonts w:ascii="Times New Roman" w:hAnsi="Times New Roman"/>
-          <w:sz w:val="22"/>
-        </w:rPr>
-        <w:t>Figure 5.1  Login Page Screenshot</w:t>
+        <w:br w:type="page"/>
       </w:r>
     </w:p>
     <w:p>
-      <w:pPr>
-        <w:spacing w:after="40"/>
-      </w:pPr>
+      <w:pPr/>
       <w:r>
-        <w:rPr>
-          <w:rFonts w:ascii="Times New Roman" w:hAnsi="Times New Roman"/>
-          <w:sz w:val="22"/>
-        </w:rPr>
-        <w:t>Figure 5.2  Dashboard Overview Screenshot</w:t>
+        <w:t>Figure 5.1  Login Page</w:t>
       </w:r>
     </w:p>
     <w:p>
-      <w:pPr>
-        <w:spacing w:after="40"/>
-      </w:pPr>
+      <w:pPr/>
       <w:r>
-        <w:rPr>
-          <w:rFonts w:ascii="Times New Roman" w:hAnsi="Times New Roman"/>
-          <w:sz w:val="22"/>
-        </w:rPr>
-        <w:t>Figure 5.3  Cluster Management Screenshot</w:t>
+        <w:t>Figure 5.2  User Registration Page</w:t>
       </w:r>
     </w:p>
     <w:p>
-      <w:pPr>
-        <w:spacing w:after="40"/>
-      </w:pPr>
+      <w:pPr/>
       <w:r>
-        <w:rPr>
-          <w:rFonts w:ascii="Times New Roman" w:hAnsi="Times New Roman"/>
-          <w:sz w:val="22"/>
-        </w:rPr>
-        <w:t>Figure 5.4  Anomaly Detection Interface Screenshot</w:t>
+        <w:t>Figure 5.3  User Dashboard</w:t>
       </w:r>
     </w:p>
     <w:p>
+      <w:pPr/>
       <w:r>
-        <w:br w:type="page"/>
+        <w:t>Figure 5.4  Cluster Management Page</w:t>
+      </w:r>
+    </w:p>
+    <w:p>
+      <w:pPr/>
+      <w:r>
+        <w:t>Figure 5.5  Cluster Overview Page</w:t>
+      </w:r>
+    </w:p>
+    <w:p>
+      <w:pPr/>
+      <w:r>
+        <w:t>Figure 5.6  Workloads Page</w:t>
+      </w:r>
+    </w:p>
+    <w:p>
+      <w:pPr/>
+      <w:r>
+        <w:t>Figure 5.7  Pods Management Page</w:t>
+      </w:r>
+    </w:p>
+    <w:p>
+      <w:pPr/>
+      <w:r>
+        <w:t>Figure 5.8  Metrics Dashboard</w:t>
+      </w:r>
+    </w:p>
+    <w:p>
+      <w:pPr/>
+      <w:r>
+        <w:t>Figure 5.9  Observability Page</w:t>
+      </w:r>
+    </w:p>
+    <w:p>
+      <w:pPr/>
+      <w:r>
+        <w:t>Figure 5.10  Log Viewer Page</w:t>
+      </w:r>
+    </w:p>
+    <w:p>
+      <w:pPr/>
+      <w:r>
+        <w:t>Figure 5.11  Root Cause Analysis Page</w:t>
+      </w:r>
+    </w:p>
+    <w:p>
+      <w:pPr/>
+      <w:r>
+        <w:t>Figure 5.12  Alerts Management Page</w:t>
       </w:r>
     </w:p>
     <w:p>
@@ -18205,6 +18235,717 @@
         <w:br w:type="page"/>
       </w:r>
     </w:p>
+    <w:p>
+      <w:pPr>
+        <w:pStyle w:val="Heading2"/>
+      </w:pPr>
+      <w:r>
+        <w:t>5.6  System Interface Demonstration</w:t>
+      </w:r>
+    </w:p>
+    <w:p>
+      <w:pPr/>
+      <w:r>
+        <w:t>This section presents screenshots of the implemented K8s Dashboard web application, demonstrating the key features and user interfaces described in the preceding sections. The screenshots illustrate the complete user workflow from authentication through cluster monitoring, metric visualization, log analysis, and anomaly detection. Each figure is accompanied by a description of the interface elements and their corresponding functionality.</w:t>
+      </w:r>
+    </w:p>
+    <w:p/>
+    <w:p>
+      <w:pPr>
+        <w:jc w:val="center"/>
+      </w:pPr>
+      <w:r>
+        <w:drawing>
+          <wp:inline xmlns:a="http://schemas.openxmlformats.org/drawingml/2006/main" xmlns:pic="http://schemas.openxmlformats.org/drawingml/2006/picture">
+            <wp:extent cx="4572000" cy="2105746"/>
+            <wp:docPr id="1" name="Picture 1"/>
+            <wp:cNvGraphicFramePr>
+              <a:graphicFrameLocks noChangeAspect="1"/>
+            </wp:cNvGraphicFramePr>
+            <a:graphic>
+              <a:graphicData uri="http://schemas.openxmlformats.org/drawingml/2006/picture">
+                <pic:pic>
+                  <pic:nvPicPr>
+                    <pic:cNvPr id="0" name="Screenshot 2026-04-05 151807.png"/>
+                    <pic:cNvPicPr/>
+                  </pic:nvPicPr>
+                  <pic:blipFill>
+                    <a:blip r:embed="rId9"/>
+                    <a:stretch>
+                      <a:fillRect/>
+                    </a:stretch>
+                  </pic:blipFill>
+                  <pic:spPr>
+                    <a:xfrm>
+                      <a:off x="0" y="0"/>
+                      <a:ext cx="4572000" cy="2105746"/>
+                    </a:xfrm>
+                    <a:prstGeom prst="rect"/>
+                  </pic:spPr>
+                </pic:pic>
+              </a:graphicData>
+            </a:graphic>
+          </wp:inline>
+        </w:drawing>
+      </w:r>
+    </w:p>
+    <w:p>
+      <w:pPr>
+        <w:jc w:val="center"/>
+      </w:pPr>
+      <w:r>
+        <w:rPr>
+          <w:b/>
+          <w:sz w:val="20"/>
+        </w:rPr>
+        <w:t>Figure 5.1  Login Page</w:t>
+      </w:r>
+    </w:p>
+    <w:p>
+      <w:pPr/>
+      <w:r>
+        <w:t>Figure 5.1 shows the login page of the K8s Dashboard application. The interface presents a clean authentication form where users enter their username and password to access the system. The login page serves as the entry point for both regular users and administrators, implementing JWT-based authentication with bcrypt password hashing for secure credential verification.</w:t>
+      </w:r>
+    </w:p>
+    <w:p/>
+    <w:p>
+      <w:pPr>
+        <w:jc w:val="center"/>
+      </w:pPr>
+      <w:r>
+        <w:drawing>
+          <wp:inline xmlns:a="http://schemas.openxmlformats.org/drawingml/2006/main" xmlns:pic="http://schemas.openxmlformats.org/drawingml/2006/picture">
+            <wp:extent cx="4572000" cy="2119312"/>
+            <wp:docPr id="2" name="Picture 2"/>
+            <wp:cNvGraphicFramePr>
+              <a:graphicFrameLocks noChangeAspect="1"/>
+            </wp:cNvGraphicFramePr>
+            <a:graphic>
+              <a:graphicData uri="http://schemas.openxmlformats.org/drawingml/2006/picture">
+                <pic:pic>
+                  <pic:nvPicPr>
+                    <pic:cNvPr id="0" name="Screenshot 2026-04-05 151827.png"/>
+                    <pic:cNvPicPr/>
+                  </pic:nvPicPr>
+                  <pic:blipFill>
+                    <a:blip r:embed="rId10"/>
+                    <a:stretch>
+                      <a:fillRect/>
+                    </a:stretch>
+                  </pic:blipFill>
+                  <pic:spPr>
+                    <a:xfrm>
+                      <a:off x="0" y="0"/>
+                      <a:ext cx="4572000" cy="2119312"/>
+                    </a:xfrm>
+                    <a:prstGeom prst="rect"/>
+                  </pic:spPr>
+                </pic:pic>
+              </a:graphicData>
+            </a:graphic>
+          </wp:inline>
+        </w:drawing>
+      </w:r>
+    </w:p>
+    <w:p>
+      <w:pPr>
+        <w:jc w:val="center"/>
+      </w:pPr>
+      <w:r>
+        <w:rPr>
+          <w:b/>
+          <w:sz w:val="20"/>
+        </w:rPr>
+        <w:t>Figure 5.2  User Registration Page</w:t>
+      </w:r>
+    </w:p>
+    <w:p>
+      <w:pPr/>
+      <w:r>
+        <w:t>Figure 5.2 displays the user registration (signup) page. New users can create an account by providing a username, email address, and password. The registration form includes client-side validation to ensure data integrity before submission. Upon successful registration, the system creates a new user account with the default 'user' role and stores the hashed password in the database.</w:t>
+      </w:r>
+    </w:p>
+    <w:p/>
+    <w:p>
+      <w:pPr>
+        <w:jc w:val="center"/>
+      </w:pPr>
+      <w:r>
+        <w:drawing>
+          <wp:inline xmlns:a="http://schemas.openxmlformats.org/drawingml/2006/main" xmlns:pic="http://schemas.openxmlformats.org/drawingml/2006/picture">
+            <wp:extent cx="4572000" cy="2124846"/>
+            <wp:docPr id="3" name="Picture 3"/>
+            <wp:cNvGraphicFramePr>
+              <a:graphicFrameLocks noChangeAspect="1"/>
+            </wp:cNvGraphicFramePr>
+            <a:graphic>
+              <a:graphicData uri="http://schemas.openxmlformats.org/drawingml/2006/picture">
+                <pic:pic>
+                  <pic:nvPicPr>
+                    <pic:cNvPr id="0" name="Screenshot 2026-04-05 151906.png"/>
+                    <pic:cNvPicPr/>
+                  </pic:nvPicPr>
+                  <pic:blipFill>
+                    <a:blip r:embed="rId11"/>
+                    <a:stretch>
+                      <a:fillRect/>
+                    </a:stretch>
+                  </pic:blipFill>
+                  <pic:spPr>
+                    <a:xfrm>
+                      <a:off x="0" y="0"/>
+                      <a:ext cx="4572000" cy="2124846"/>
+                    </a:xfrm>
+                    <a:prstGeom prst="rect"/>
+                  </pic:spPr>
+                </pic:pic>
+              </a:graphicData>
+            </a:graphic>
+          </wp:inline>
+        </w:drawing>
+      </w:r>
+    </w:p>
+    <w:p>
+      <w:pPr>
+        <w:jc w:val="center"/>
+      </w:pPr>
+      <w:r>
+        <w:rPr>
+          <w:b/>
+          <w:sz w:val="20"/>
+        </w:rPr>
+        <w:t>Figure 5.3  User Dashboard</w:t>
+      </w:r>
+    </w:p>
+    <w:p>
+      <w:pPr/>
+      <w:r>
+        <w:t>Figure 5.3 shows the User Dashboard, which serves as the landing page for regular (non-admin) users after login. It provides a personalized overview including the number of pods viewed, nodes viewed, active alerts, and last login time. The dashboard also displays the current system status of the API server, cluster connection, and monitoring service, giving users an at-a-glance summary of their monitoring environment.</w:t>
+      </w:r>
+    </w:p>
+    <w:p/>
+    <w:p>
+      <w:pPr>
+        <w:jc w:val="center"/>
+      </w:pPr>
+      <w:r>
+        <w:drawing>
+          <wp:inline xmlns:a="http://schemas.openxmlformats.org/drawingml/2006/main" xmlns:pic="http://schemas.openxmlformats.org/drawingml/2006/picture">
+            <wp:extent cx="4572000" cy="2100262"/>
+            <wp:docPr id="4" name="Picture 4"/>
+            <wp:cNvGraphicFramePr>
+              <a:graphicFrameLocks noChangeAspect="1"/>
+            </wp:cNvGraphicFramePr>
+            <a:graphic>
+              <a:graphicData uri="http://schemas.openxmlformats.org/drawingml/2006/picture">
+                <pic:pic>
+                  <pic:nvPicPr>
+                    <pic:cNvPr id="0" name="Screenshot 2026-04-05 151931.png"/>
+                    <pic:cNvPicPr/>
+                  </pic:nvPicPr>
+                  <pic:blipFill>
+                    <a:blip r:embed="rId12"/>
+                    <a:stretch>
+                      <a:fillRect/>
+                    </a:stretch>
+                  </pic:blipFill>
+                  <pic:spPr>
+                    <a:xfrm>
+                      <a:off x="0" y="0"/>
+                      <a:ext cx="4572000" cy="2100262"/>
+                    </a:xfrm>
+                    <a:prstGeom prst="rect"/>
+                  </pic:spPr>
+                </pic:pic>
+              </a:graphicData>
+            </a:graphic>
+          </wp:inline>
+        </w:drawing>
+      </w:r>
+    </w:p>
+    <w:p>
+      <w:pPr>
+        <w:jc w:val="center"/>
+      </w:pPr>
+      <w:r>
+        <w:rPr>
+          <w:b/>
+          <w:sz w:val="20"/>
+        </w:rPr>
+        <w:t>Figure 5.4  Cluster Management Page</w:t>
+      </w:r>
+    </w:p>
+    <w:p>
+      <w:pPr/>
+      <w:r>
+        <w:t>Figure 5.4 presents the Cluster Management page where users can add, configure, and manage their Kubernetes clusters. Users can upload kubeconfig files or manually enter cluster API server addresses and authentication tokens. The page displays a list of all registered clusters with their connection status, Kubernetes version, and management actions. This multi-cluster management capability allows users to monitor multiple environments from a single dashboard.</w:t>
+      </w:r>
+    </w:p>
+    <w:p/>
+    <w:p>
+      <w:pPr>
+        <w:jc w:val="center"/>
+      </w:pPr>
+      <w:r>
+        <w:drawing>
+          <wp:inline xmlns:a="http://schemas.openxmlformats.org/drawingml/2006/main" xmlns:pic="http://schemas.openxmlformats.org/drawingml/2006/picture">
+            <wp:extent cx="4572000" cy="2135981"/>
+            <wp:docPr id="5" name="Picture 5"/>
+            <wp:cNvGraphicFramePr>
+              <a:graphicFrameLocks noChangeAspect="1"/>
+            </wp:cNvGraphicFramePr>
+            <a:graphic>
+              <a:graphicData uri="http://schemas.openxmlformats.org/drawingml/2006/picture">
+                <pic:pic>
+                  <pic:nvPicPr>
+                    <pic:cNvPr id="0" name="1.png"/>
+                    <pic:cNvPicPr/>
+                  </pic:nvPicPr>
+                  <pic:blipFill>
+                    <a:blip r:embed="rId13"/>
+                    <a:stretch>
+                      <a:fillRect/>
+                    </a:stretch>
+                  </pic:blipFill>
+                  <pic:spPr>
+                    <a:xfrm>
+                      <a:off x="0" y="0"/>
+                      <a:ext cx="4572000" cy="2135981"/>
+                    </a:xfrm>
+                    <a:prstGeom prst="rect"/>
+                  </pic:spPr>
+                </pic:pic>
+              </a:graphicData>
+            </a:graphic>
+          </wp:inline>
+        </w:drawing>
+      </w:r>
+    </w:p>
+    <w:p>
+      <w:pPr>
+        <w:jc w:val="center"/>
+      </w:pPr>
+      <w:r>
+        <w:rPr>
+          <w:b/>
+          <w:sz w:val="20"/>
+        </w:rPr>
+        <w:t>Figure 5.5  Cluster Overview Page</w:t>
+      </w:r>
+    </w:p>
+    <w:p>
+      <w:pPr/>
+      <w:r>
+        <w:t>Figure 5.5 shows the Cluster Overview page, which provides a comprehensive real-time view of the selected Kubernetes cluster's health and status. The page features a prominent Cluster Health Score (computed by the anomaly detection module), along with key statistics including the number of nodes, pods, and deployments. Below the health score, detailed Cluster Information cards display the Kubernetes version, platform architecture, and connection status. The left sidebar shows the navigation menu with the namespace selector for filtering resources.</w:t>
+      </w:r>
+    </w:p>
+    <w:p/>
+    <w:p>
+      <w:pPr>
+        <w:jc w:val="center"/>
+      </w:pPr>
+      <w:r>
+        <w:drawing>
+          <wp:inline xmlns:a="http://schemas.openxmlformats.org/drawingml/2006/main" xmlns:pic="http://schemas.openxmlformats.org/drawingml/2006/picture">
+            <wp:extent cx="4572000" cy="2127350"/>
+            <wp:docPr id="6" name="Picture 6"/>
+            <wp:cNvGraphicFramePr>
+              <a:graphicFrameLocks noChangeAspect="1"/>
+            </wp:cNvGraphicFramePr>
+            <a:graphic>
+              <a:graphicData uri="http://schemas.openxmlformats.org/drawingml/2006/picture">
+                <pic:pic>
+                  <pic:nvPicPr>
+                    <pic:cNvPr id="0" name="Screenshot 2026-04-05 152107.png"/>
+                    <pic:cNvPicPr/>
+                  </pic:nvPicPr>
+                  <pic:blipFill>
+                    <a:blip r:embed="rId14"/>
+                    <a:stretch>
+                      <a:fillRect/>
+                    </a:stretch>
+                  </pic:blipFill>
+                  <pic:spPr>
+                    <a:xfrm>
+                      <a:off x="0" y="0"/>
+                      <a:ext cx="4572000" cy="2127350"/>
+                    </a:xfrm>
+                    <a:prstGeom prst="rect"/>
+                  </pic:spPr>
+                </pic:pic>
+              </a:graphicData>
+            </a:graphic>
+          </wp:inline>
+        </w:drawing>
+      </w:r>
+    </w:p>
+    <w:p>
+      <w:pPr>
+        <w:jc w:val="center"/>
+      </w:pPr>
+      <w:r>
+        <w:rPr>
+          <w:b/>
+          <w:sz w:val="20"/>
+        </w:rPr>
+        <w:t>Figure 5.6  Workloads Page</w:t>
+      </w:r>
+    </w:p>
+    <w:p>
+      <w:pPr/>
+      <w:r>
+        <w:t>Figure 5.6 displays the Workloads page, which provides an overview of all Kubernetes workload resources including Deployments, StatefulSets, DaemonSets, and Jobs. Each workload entry shows its name, namespace, replica count, and current status. Users can perform actions such as scaling deployments and viewing detailed workload information. This page helps operators quickly assess the state of all running applications in the cluster.</w:t>
+      </w:r>
+    </w:p>
+    <w:p/>
+    <w:p>
+      <w:pPr>
+        <w:jc w:val="center"/>
+      </w:pPr>
+      <w:r>
+        <w:drawing>
+          <wp:inline xmlns:a="http://schemas.openxmlformats.org/drawingml/2006/main" xmlns:pic="http://schemas.openxmlformats.org/drawingml/2006/picture">
+            <wp:extent cx="4572000" cy="2126567"/>
+            <wp:docPr id="7" name="Picture 7"/>
+            <wp:cNvGraphicFramePr>
+              <a:graphicFrameLocks noChangeAspect="1"/>
+            </wp:cNvGraphicFramePr>
+            <a:graphic>
+              <a:graphicData uri="http://schemas.openxmlformats.org/drawingml/2006/picture">
+                <pic:pic>
+                  <pic:nvPicPr>
+                    <pic:cNvPr id="0" name="Screenshot 2026-04-05 152158.png"/>
+                    <pic:cNvPicPr/>
+                  </pic:nvPicPr>
+                  <pic:blipFill>
+                    <a:blip r:embed="rId15"/>
+                    <a:stretch>
+                      <a:fillRect/>
+                    </a:stretch>
+                  </pic:blipFill>
+                  <pic:spPr>
+                    <a:xfrm>
+                      <a:off x="0" y="0"/>
+                      <a:ext cx="4572000" cy="2126567"/>
+                    </a:xfrm>
+                    <a:prstGeom prst="rect"/>
+                  </pic:spPr>
+                </pic:pic>
+              </a:graphicData>
+            </a:graphic>
+          </wp:inline>
+        </w:drawing>
+      </w:r>
+    </w:p>
+    <w:p>
+      <w:pPr>
+        <w:jc w:val="center"/>
+      </w:pPr>
+      <w:r>
+        <w:rPr>
+          <w:b/>
+          <w:sz w:val="20"/>
+        </w:rPr>
+        <w:t>Figure 5.7  Pods Management Page</w:t>
+      </w:r>
+    </w:p>
+    <w:p>
+      <w:pPr/>
+      <w:r>
+        <w:t>Figure 5.7 shows the Pods management page, which lists all pods running in the selected namespace. The page displays essential information for each pod including its name, status (Running, Pending, Failed), the number of container restarts, age, and the node it is scheduled on. Users can filter pods by namespace and search for specific pods. This view is critical for operators to monitor container health and troubleshoot issues at the pod level.</w:t>
+      </w:r>
+    </w:p>
+    <w:p/>
+    <w:p>
+      <w:pPr>
+        <w:jc w:val="center"/>
+      </w:pPr>
+      <w:r>
+        <w:drawing>
+          <wp:inline xmlns:a="http://schemas.openxmlformats.org/drawingml/2006/main" xmlns:pic="http://schemas.openxmlformats.org/drawingml/2006/picture">
+            <wp:extent cx="4572000" cy="2134562"/>
+            <wp:docPr id="8" name="Picture 8"/>
+            <wp:cNvGraphicFramePr>
+              <a:graphicFrameLocks noChangeAspect="1"/>
+            </wp:cNvGraphicFramePr>
+            <a:graphic>
+              <a:graphicData uri="http://schemas.openxmlformats.org/drawingml/2006/picture">
+                <pic:pic>
+                  <pic:nvPicPr>
+                    <pic:cNvPr id="0" name="Screenshot 2026-04-05 152215.png"/>
+                    <pic:cNvPicPr/>
+                  </pic:nvPicPr>
+                  <pic:blipFill>
+                    <a:blip r:embed="rId16"/>
+                    <a:stretch>
+                      <a:fillRect/>
+                    </a:stretch>
+                  </pic:blipFill>
+                  <pic:spPr>
+                    <a:xfrm>
+                      <a:off x="0" y="0"/>
+                      <a:ext cx="4572000" cy="2134562"/>
+                    </a:xfrm>
+                    <a:prstGeom prst="rect"/>
+                  </pic:spPr>
+                </pic:pic>
+              </a:graphicData>
+            </a:graphic>
+          </wp:inline>
+        </w:drawing>
+      </w:r>
+    </w:p>
+    <w:p>
+      <w:pPr>
+        <w:jc w:val="center"/>
+      </w:pPr>
+      <w:r>
+        <w:rPr>
+          <w:b/>
+          <w:sz w:val="20"/>
+        </w:rPr>
+        <w:t>Figure 5.8  Metrics Dashboard</w:t>
+      </w:r>
+    </w:p>
+    <w:p>
+      <w:pPr/>
+      <w:r>
+        <w:t>Figure 5.8 presents the Metrics dashboard, which visualizes real-time cluster resource utilization through interactive charts rendered using the Recharts library. The page displays time-series graphs for CPU utilization, memory usage, network I/O throughput, and storage consumption. Resource distribution pie charts provide a proportional view of resource allocation across the cluster. This visualization layer transforms raw Kubernetes metrics into actionable insights for capacity planning and performance monitoring.</w:t>
+      </w:r>
+    </w:p>
+    <w:p/>
+    <w:p>
+      <w:pPr>
+        <w:jc w:val="center"/>
+      </w:pPr>
+      <w:r>
+        <w:drawing>
+          <wp:inline xmlns:a="http://schemas.openxmlformats.org/drawingml/2006/main" xmlns:pic="http://schemas.openxmlformats.org/drawingml/2006/picture">
+            <wp:extent cx="4572000" cy="2105746"/>
+            <wp:docPr id="9" name="Picture 9"/>
+            <wp:cNvGraphicFramePr>
+              <a:graphicFrameLocks noChangeAspect="1"/>
+            </wp:cNvGraphicFramePr>
+            <a:graphic>
+              <a:graphicData uri="http://schemas.openxmlformats.org/drawingml/2006/picture">
+                <pic:pic>
+                  <pic:nvPicPr>
+                    <pic:cNvPr id="0" name="Screenshot 2026-04-05 152242.png"/>
+                    <pic:cNvPicPr/>
+                  </pic:nvPicPr>
+                  <pic:blipFill>
+                    <a:blip r:embed="rId17"/>
+                    <a:stretch>
+                      <a:fillRect/>
+                    </a:stretch>
+                  </pic:blipFill>
+                  <pic:spPr>
+                    <a:xfrm>
+                      <a:off x="0" y="0"/>
+                      <a:ext cx="4572000" cy="2105746"/>
+                    </a:xfrm>
+                    <a:prstGeom prst="rect"/>
+                  </pic:spPr>
+                </pic:pic>
+              </a:graphicData>
+            </a:graphic>
+          </wp:inline>
+        </w:drawing>
+      </w:r>
+    </w:p>
+    <w:p>
+      <w:pPr>
+        <w:jc w:val="center"/>
+      </w:pPr>
+      <w:r>
+        <w:rPr>
+          <w:b/>
+          <w:sz w:val="20"/>
+        </w:rPr>
+        <w:t>Figure 5.9  Observability Page</w:t>
+      </w:r>
+    </w:p>
+    <w:p>
+      <w:pPr/>
+      <w:r>
+        <w:t>Figure 5.9 shows the Observability page, which provides detailed time-series metric monitoring with configurable time ranges (15 minutes, 1 hour, 6 hours, 24 hours). The page features line charts tracking CPU usage, memory consumption, network I/O, and pod restart counts over the selected period. This view enables operators to identify trends, detect gradual degradation, and correlate metric patterns across different resource dimensions.</w:t>
+      </w:r>
+    </w:p>
+    <w:p/>
+    <w:p>
+      <w:pPr>
+        <w:jc w:val="center"/>
+      </w:pPr>
+      <w:r>
+        <w:drawing>
+          <wp:inline xmlns:a="http://schemas.openxmlformats.org/drawingml/2006/main" xmlns:pic="http://schemas.openxmlformats.org/drawingml/2006/picture">
+            <wp:extent cx="4572000" cy="2137778"/>
+            <wp:docPr id="10" name="Picture 10"/>
+            <wp:cNvGraphicFramePr>
+              <a:graphicFrameLocks noChangeAspect="1"/>
+            </wp:cNvGraphicFramePr>
+            <a:graphic>
+              <a:graphicData uri="http://schemas.openxmlformats.org/drawingml/2006/picture">
+                <pic:pic>
+                  <pic:nvPicPr>
+                    <pic:cNvPr id="0" name="Screenshot 2026-04-05 152314.png"/>
+                    <pic:cNvPicPr/>
+                  </pic:nvPicPr>
+                  <pic:blipFill>
+                    <a:blip r:embed="rId18"/>
+                    <a:stretch>
+                      <a:fillRect/>
+                    </a:stretch>
+                  </pic:blipFill>
+                  <pic:spPr>
+                    <a:xfrm>
+                      <a:off x="0" y="0"/>
+                      <a:ext cx="4572000" cy="2137778"/>
+                    </a:xfrm>
+                    <a:prstGeom prst="rect"/>
+                  </pic:spPr>
+                </pic:pic>
+              </a:graphicData>
+            </a:graphic>
+          </wp:inline>
+        </w:drawing>
+      </w:r>
+    </w:p>
+    <w:p>
+      <w:pPr>
+        <w:jc w:val="center"/>
+      </w:pPr>
+      <w:r>
+        <w:rPr>
+          <w:b/>
+          <w:sz w:val="20"/>
+        </w:rPr>
+        <w:t>Figure 5.10  Log Viewer Page</w:t>
+      </w:r>
+    </w:p>
+    <w:p>
+      <w:pPr/>
+      <w:r>
+        <w:t>Figure 5.10 displays the Log Viewer page, which aggregates and presents container logs from across the cluster. Users can select a specific pod and namespace to view its logs, with options to filter by log level and search for specific text. The log viewer supports downloading log data for offline analysis. This centralized logging interface eliminates the need for direct kubectl access to view container output.</w:t>
+      </w:r>
+    </w:p>
+    <w:p/>
+    <w:p>
+      <w:pPr>
+        <w:jc w:val="center"/>
+      </w:pPr>
+      <w:r>
+        <w:drawing>
+          <wp:inline xmlns:a="http://schemas.openxmlformats.org/drawingml/2006/main" xmlns:pic="http://schemas.openxmlformats.org/drawingml/2006/picture">
+            <wp:extent cx="4572000" cy="2110154"/>
+            <wp:docPr id="11" name="Picture 11"/>
+            <wp:cNvGraphicFramePr>
+              <a:graphicFrameLocks noChangeAspect="1"/>
+            </wp:cNvGraphicFramePr>
+            <a:graphic>
+              <a:graphicData uri="http://schemas.openxmlformats.org/drawingml/2006/picture">
+                <pic:pic>
+                  <pic:nvPicPr>
+                    <pic:cNvPr id="0" name="Screenshot 2026-04-05 152342.png"/>
+                    <pic:cNvPicPr/>
+                  </pic:nvPicPr>
+                  <pic:blipFill>
+                    <a:blip r:embed="rId19"/>
+                    <a:stretch>
+                      <a:fillRect/>
+                    </a:stretch>
+                  </pic:blipFill>
+                  <pic:spPr>
+                    <a:xfrm>
+                      <a:off x="0" y="0"/>
+                      <a:ext cx="4572000" cy="2110154"/>
+                    </a:xfrm>
+                    <a:prstGeom prst="rect"/>
+                  </pic:spPr>
+                </pic:pic>
+              </a:graphicData>
+            </a:graphic>
+          </wp:inline>
+        </w:drawing>
+      </w:r>
+    </w:p>
+    <w:p>
+      <w:pPr>
+        <w:jc w:val="center"/>
+      </w:pPr>
+      <w:r>
+        <w:rPr>
+          <w:b/>
+          <w:sz w:val="20"/>
+        </w:rPr>
+        <w:t>Figure 5.11  Root Cause Analysis Page</w:t>
+      </w:r>
+    </w:p>
+    <w:p>
+      <w:pPr/>
+      <w:r>
+        <w:t>Figure 5.11 shows the Root Cause Analysis page, which implements the Isolation Forest-based anomaly detection interface. The page displays detected anomalies with severity levels (critical, warning, info), contributing factors identified through z-score analysis, and correlated cluster events. Each anomaly entry includes a confidence score and a list of metrics that contributed to the detection. This intelligent analysis helps operators quickly identify the underlying causes of cluster issues rather than merely observing symptoms.</w:t>
+      </w:r>
+    </w:p>
+    <w:p/>
+    <w:p>
+      <w:pPr>
+        <w:jc w:val="center"/>
+      </w:pPr>
+      <w:r>
+        <w:drawing>
+          <wp:inline xmlns:a="http://schemas.openxmlformats.org/drawingml/2006/main" xmlns:pic="http://schemas.openxmlformats.org/drawingml/2006/picture">
+            <wp:extent cx="4572000" cy="2109788"/>
+            <wp:docPr id="12" name="Picture 12"/>
+            <wp:cNvGraphicFramePr>
+              <a:graphicFrameLocks noChangeAspect="1"/>
+            </wp:cNvGraphicFramePr>
+            <a:graphic>
+              <a:graphicData uri="http://schemas.openxmlformats.org/drawingml/2006/picture">
+                <pic:pic>
+                  <pic:nvPicPr>
+                    <pic:cNvPr id="0" name="Screenshot 2026-04-05 152447.png"/>
+                    <pic:cNvPicPr/>
+                  </pic:nvPicPr>
+                  <pic:blipFill>
+                    <a:blip r:embed="rId20"/>
+                    <a:stretch>
+                      <a:fillRect/>
+                    </a:stretch>
+                  </pic:blipFill>
+                  <pic:spPr>
+                    <a:xfrm>
+                      <a:off x="0" y="0"/>
+                      <a:ext cx="4572000" cy="2109788"/>
+                    </a:xfrm>
+                    <a:prstGeom prst="rect"/>
+                  </pic:spPr>
+                </pic:pic>
+              </a:graphicData>
+            </a:graphic>
+          </wp:inline>
+        </w:drawing>
+      </w:r>
+    </w:p>
+    <w:p>
+      <w:pPr>
+        <w:jc w:val="center"/>
+      </w:pPr>
+      <w:r>
+        <w:rPr>
+          <w:b/>
+          <w:sz w:val="20"/>
+        </w:rPr>
+        <w:t>Figure 5.12  Alerts Management Page</w:t>
+      </w:r>
+    </w:p>
+    <w:p>
+      <w:pPr/>
+      <w:r>
+        <w:t>Figure 5.12 presents the Alerts management page (accessible to administrators), which provides a comprehensive view of all active and historical alerts. The page displays alert statistics, severity distribution (critical, error, warning), and configurable alert rules. Administrators can acknowledge, resolve, and manage alert rules from this interface. The alert system integrates with the anomaly detection module to automatically generate alerts when cluster metrics exceed configured thresholds.</w:t>
+      </w:r>
+    </w:p>
+    <w:p/>
     <w:p>
       <w:pPr>
         <w:pStyle w:val="Heading1"/>

</xml_diff>